<commit_message>
Revise all 5 SSW support templates: table-first layout, specific checklists, bold variables
- Replace all prose with table/checkbox (□) structure throughout
- Add specific action items for 生活オリエンテーション: 銀行口座開設・住民登録・
  マイナンバー申請・防犯防災指導・緊急連絡先カード・ゴミ分別 etc.
- Add specific action items for all 10 mandatory support categories
- Bold all variable fields as [変数名] for 3-minute fill-in completion
- Regenerate all .docx files from revised markdown sources
- Add v2 ZIP archive

https://claude.ai/code/session_01HkqY8fDcvALfBjJDS4gxMq
</commit_message>
<xml_diff>
--- a/ssw-support-templates/04_定期面談報告書_監督者用.docx
+++ b/ssw-support-templates/04_定期面談報告書_監督者用.docx
@@ -4,7 +4,6 @@
   <w:body>
     <w:p>
       <w:pPr>
-        <w:pStyle w:val="Heading1"/>
         <w:jc w:val="center"/>
       </w:pPr>
       <w:r>
@@ -12,1540 +11,57 @@
           <w:b/>
           <w:sz w:val="28"/>
         </w:rPr>
-        <w:t>参考様式第４－４号｜定期面談報告書（監督者用）</w:t>
-      </w:r>
-    </w:p>
-    <w:p/>
-    <w:p>
-      <w:pPr/>
-      <w:r>
-        <w:rPr>
-          <w:i/>
-          <w:color w:val="555555"/>
-          <w:sz w:val="18"/>
-        </w:rPr>
-        <w:t>**凡例**</w:t>
-      </w:r>
-    </w:p>
-    <w:p>
-      <w:pPr/>
-      <w:r>
-        <w:rPr>
-          <w:i/>
-          <w:color w:val="555555"/>
-          <w:sz w:val="18"/>
-        </w:rPr>
-        <w:t>- `██ 固定情報 ██` … 会社マスタ（初回のみ設定）</w:t>
-      </w:r>
-    </w:p>
-    <w:p>
-      <w:pPr/>
-      <w:r>
-        <w:rPr>
-          <w:i/>
-          <w:color w:val="555555"/>
-          <w:sz w:val="18"/>
-        </w:rPr>
-        <w:t>- `[変数名]` … 面談ごとに書き換える変数</w:t>
-      </w:r>
-    </w:p>
-    <w:p>
-      <w:pPr/>
-      <w:r>
-        <w:rPr>
-          <w:i/>
-          <w:color w:val="555555"/>
-          <w:sz w:val="18"/>
-        </w:rPr>
-        <w:t>- 本書は**受入機関の監督者との定期面談（3ヶ月に1回以上）のたびに1枚作成**する</w:t>
-      </w:r>
-    </w:p>
-    <w:p>
-      <w:pPr/>
-      <w:r>
-        <w:rPr>
-          <w:i/>
-          <w:color w:val="555555"/>
-          <w:sz w:val="18"/>
-        </w:rPr>
-        <w:t>- 外国人用（第４－３号）と必ずセットで保管・提出すること</w:t>
-      </w:r>
-    </w:p>
-    <w:p>
-      <w:pPr/>
-      <w:r>
-        <w:rPr>
-          <w:i/>
-          <w:color w:val="555555"/>
-          <w:sz w:val="18"/>
-        </w:rPr>
-        <w:t>- 「監督者」＝受入機関において外国人を直接指揮監督する者（現場責任者・上長等）</w:t>
+        <w:t>定期面談報告書・監督者用（参考様式第４－４号）</w:t>
       </w:r>
     </w:p>
     <w:p/>
     <w:p>
       <w:r>
-        <w:t>────────────────────────────────────────</w:t>
-      </w:r>
-    </w:p>
-    <w:p/>
-    <w:p>
-      <w:pPr/>
-      <w:r>
         <w:rPr>
-          <w:rFonts w:ascii="Courier New" w:hAnsi="Courier New"/>
-          <w:sz w:val="18"/>
+          <w:i/>
+          <w:color w:val="666666"/>
+          <w:sz w:val="17"/>
         </w:rPr>
-        <w:t>━━━━━━━━━━━━━━━━━━━━━━━━━━━━━━━━━━━━━━━━</w:t>
+        <w:t xml:space="preserve">受入機関の監督者との定期面談（3ヶ月に1回以上）のたびに1枚作成。  </w:t>
       </w:r>
     </w:p>
     <w:p>
-      <w:pPr/>
       <w:r>
         <w:rPr>
-          <w:rFonts w:ascii="Courier New" w:hAnsi="Courier New"/>
-          <w:sz w:val="18"/>
+          <w:i/>
+          <w:color w:val="666666"/>
+          <w:sz w:val="17"/>
         </w:rPr>
-        <w:t xml:space="preserve">         定期面談報告書（監督者用）</w:t>
+        <w:t xml:space="preserve">本書（第４－４号）と外国人用（第４－３号）は**必ずセットで**保管・提出すること。  </w:t>
       </w:r>
     </w:p>
     <w:p>
-      <w:pPr/>
       <w:r>
         <w:rPr>
-          <w:rFonts w:ascii="Courier New" w:hAnsi="Courier New"/>
-          <w:sz w:val="18"/>
+          <w:i/>
+          <w:color w:val="666666"/>
+          <w:sz w:val="17"/>
         </w:rPr>
-        <w:t xml:space="preserve">             （参考様式第４－４号）</w:t>
-      </w:r>
-    </w:p>
-    <w:p>
-      <w:pPr/>
-      <w:r>
-        <w:rPr>
-          <w:rFonts w:ascii="Courier New" w:hAnsi="Courier New"/>
-          <w:sz w:val="18"/>
-        </w:rPr>
-        <w:t>━━━━━━━━━━━━━━━━━━━━━━━━━━━━━━━━━━━━━━━━</w:t>
-      </w:r>
-    </w:p>
-    <w:p>
-      <w:pPr/>
-    </w:p>
-    <w:p>
-      <w:pPr/>
-      <w:r>
-        <w:rPr>
-          <w:rFonts w:ascii="Courier New" w:hAnsi="Courier New"/>
-          <w:sz w:val="18"/>
-        </w:rPr>
-        <w:t>面談実施日：令和 [面談年] 年 [面談月] 月 [面談日] 日</w:t>
-      </w:r>
-    </w:p>
-    <w:p>
-      <w:pPr/>
-      <w:r>
-        <w:rPr>
-          <w:rFonts w:ascii="Courier New" w:hAnsi="Courier New"/>
-          <w:sz w:val="18"/>
-        </w:rPr>
-        <w:t>報告書番号：[報告書番号]  （例：2025-Q2-SUP-001）</w:t>
-      </w:r>
-    </w:p>
-    <w:p>
-      <w:pPr/>
-    </w:p>
-    <w:p>
-      <w:pPr/>
-      <w:r>
-        <w:rPr>
-          <w:rFonts w:ascii="Courier New" w:hAnsi="Courier New"/>
-          <w:sz w:val="18"/>
-        </w:rPr>
-        <w:t>━━━━━━━━━━━━━━━━━━━━━━━━━━━━━━</w:t>
-      </w:r>
-    </w:p>
-    <w:p>
-      <w:pPr/>
-      <w:r>
-        <w:rPr>
-          <w:rFonts w:ascii="Courier New" w:hAnsi="Courier New"/>
-          <w:sz w:val="18"/>
-        </w:rPr>
-        <w:t>【第１部：面談実施者情報】※ 固定情報</w:t>
-      </w:r>
-    </w:p>
-    <w:p>
-      <w:pPr/>
-      <w:r>
-        <w:rPr>
-          <w:rFonts w:ascii="Courier New" w:hAnsi="Courier New"/>
-          <w:sz w:val="18"/>
-        </w:rPr>
-        <w:t>━━━━━━━━━━━━━━━━━━━━━━━━━━━━━━</w:t>
-      </w:r>
-    </w:p>
-    <w:p>
-      <w:pPr/>
-    </w:p>
-    <w:p>
-      <w:pPr/>
-      <w:r>
-        <w:rPr>
-          <w:rFonts w:ascii="Courier New" w:hAnsi="Courier New"/>
-          <w:sz w:val="18"/>
-        </w:rPr>
-        <w:t>登録支援機関名称  ：██ [自社名称]          ██</w:t>
-      </w:r>
-    </w:p>
-    <w:p>
-      <w:pPr/>
-      <w:r>
-        <w:rPr>
-          <w:rFonts w:ascii="Courier New" w:hAnsi="Courier New"/>
-          <w:sz w:val="18"/>
-        </w:rPr>
-        <w:t>登録番号          ：██ 19登－XXXXXXXX       ██</w:t>
-      </w:r>
-    </w:p>
-    <w:p>
-      <w:pPr/>
-      <w:r>
-        <w:rPr>
-          <w:rFonts w:ascii="Courier New" w:hAnsi="Courier New"/>
-          <w:sz w:val="18"/>
-        </w:rPr>
-        <w:t>面談担当者氏名    ：██ [面談担当者氏名]     ██</w:t>
-      </w:r>
-    </w:p>
-    <w:p>
-      <w:pPr/>
-      <w:r>
-        <w:rPr>
-          <w:rFonts w:ascii="Courier New" w:hAnsi="Courier New"/>
-          <w:sz w:val="18"/>
-        </w:rPr>
-        <w:t>面談担当者の役職  ：██ [面談担当者役職]     ██</w:t>
-      </w:r>
-    </w:p>
-    <w:p>
-      <w:pPr/>
-    </w:p>
-    <w:p>
-      <w:pPr/>
-      <w:r>
-        <w:rPr>
-          <w:rFonts w:ascii="Courier New" w:hAnsi="Courier New"/>
-          <w:sz w:val="18"/>
-        </w:rPr>
-        <w:t>━━━━━━━━━━━━━━━━━━━━━━━━━━━━━━</w:t>
-      </w:r>
-    </w:p>
-    <w:p>
-      <w:pPr/>
-      <w:r>
-        <w:rPr>
-          <w:rFonts w:ascii="Courier New" w:hAnsi="Courier New"/>
-          <w:sz w:val="18"/>
-        </w:rPr>
-        <w:t>【第２部：面談対象・監督者情報】</w:t>
-      </w:r>
-    </w:p>
-    <w:p>
-      <w:pPr/>
-      <w:r>
-        <w:rPr>
-          <w:rFonts w:ascii="Courier New" w:hAnsi="Courier New"/>
-          <w:sz w:val="18"/>
-        </w:rPr>
-        <w:t>━━━━━━━━━━━━━━━━━━━━━━━━━━━━━━</w:t>
-      </w:r>
-    </w:p>
-    <w:p>
-      <w:pPr/>
-    </w:p>
-    <w:p>
-      <w:pPr/>
-      <w:r>
-        <w:rPr>
-          <w:rFonts w:ascii="Courier New" w:hAnsi="Courier New"/>
-          <w:sz w:val="18"/>
-        </w:rPr>
-        <w:t>受入機関名称          ：[受入機関名]</w:t>
-      </w:r>
-    </w:p>
-    <w:p>
-      <w:pPr/>
-      <w:r>
-        <w:rPr>
-          <w:rFonts w:ascii="Courier New" w:hAnsi="Courier New"/>
-          <w:sz w:val="18"/>
-        </w:rPr>
-        <w:t>受入機関所在地        ：[受入機関所在地]</w:t>
-      </w:r>
-    </w:p>
-    <w:p>
-      <w:pPr/>
-      <w:r>
-        <w:rPr>
-          <w:rFonts w:ascii="Courier New" w:hAnsi="Courier New"/>
-          <w:sz w:val="18"/>
-        </w:rPr>
-        <w:t>受入機関担当部署      ：[担当部署名]</w:t>
-      </w:r>
-    </w:p>
-    <w:p>
-      <w:pPr/>
-      <w:r>
-        <w:rPr>
-          <w:rFonts w:ascii="Courier New" w:hAnsi="Courier New"/>
-          <w:sz w:val="18"/>
-        </w:rPr>
-        <w:t>監督者氏名            ：[監督者氏名]</w:t>
-      </w:r>
-    </w:p>
-    <w:p>
-      <w:pPr/>
-      <w:r>
-        <w:rPr>
-          <w:rFonts w:ascii="Courier New" w:hAnsi="Courier New"/>
-          <w:sz w:val="18"/>
-        </w:rPr>
-        <w:t>監督者役職            ：[監督者役職]</w:t>
-      </w:r>
-    </w:p>
-    <w:p>
-      <w:pPr/>
-      <w:r>
-        <w:rPr>
-          <w:rFonts w:ascii="Courier New" w:hAnsi="Courier New"/>
-          <w:sz w:val="18"/>
-        </w:rPr>
-        <w:t>監督者連絡先（TEL）   ：[監督者TEL]</w:t>
-      </w:r>
-    </w:p>
-    <w:p>
-      <w:pPr/>
-      <w:r>
-        <w:rPr>
-          <w:rFonts w:ascii="Courier New" w:hAnsi="Courier New"/>
-          <w:sz w:val="18"/>
-        </w:rPr>
-        <w:t>面談回数（通算）      ：第 [面談通算回数] 回目</w:t>
-      </w:r>
-    </w:p>
-    <w:p>
-      <w:pPr/>
-    </w:p>
-    <w:p>
-      <w:pPr/>
-      <w:r>
-        <w:rPr>
-          <w:rFonts w:ascii="Courier New" w:hAnsi="Courier New"/>
-          <w:sz w:val="18"/>
-        </w:rPr>
-        <w:t>当該面談に係る外国人（複数名の場合は全員記載）：</w:t>
-      </w:r>
-    </w:p>
-    <w:p>
-      <w:pPr/>
-    </w:p>
-    <w:p>
-      <w:pPr/>
-      <w:r>
-        <w:rPr>
-          <w:rFonts w:ascii="Courier New" w:hAnsi="Courier New"/>
-          <w:sz w:val="18"/>
-        </w:rPr>
-        <w:t>| No | 氏名（ローマ字） | 国籍 | 在留カード番号 | 就労開始日 |</w:t>
-      </w:r>
-    </w:p>
-    <w:p>
-      <w:pPr/>
-      <w:r>
-        <w:rPr>
-          <w:rFonts w:ascii="Courier New" w:hAnsi="Courier New"/>
-          <w:sz w:val="18"/>
-        </w:rPr>
-        <w:t>|----|----------------|------|--------------|-----------|</w:t>
-      </w:r>
-    </w:p>
-    <w:p>
-      <w:pPr/>
-      <w:r>
-        <w:rPr>
-          <w:rFonts w:ascii="Courier New" w:hAnsi="Courier New"/>
-          <w:sz w:val="18"/>
-        </w:rPr>
-        <w:t>| 1  | [外国人氏名_1]  | [国籍_1] | [在留カード番号_1] | 令和[年_1]年[月_1]月[日_1]日 |</w:t>
-      </w:r>
-    </w:p>
-    <w:p>
-      <w:pPr/>
-      <w:r>
-        <w:rPr>
-          <w:rFonts w:ascii="Courier New" w:hAnsi="Courier New"/>
-          <w:sz w:val="18"/>
-        </w:rPr>
-        <w:t>| 2  | [外国人氏名_2]  | [国籍_2] | [在留カード番号_2] | 令和[年_2]年[月_2]月[日_2]日 |</w:t>
-      </w:r>
-    </w:p>
-    <w:p>
-      <w:pPr/>
-      <w:r>
-        <w:rPr>
-          <w:rFonts w:ascii="Courier New" w:hAnsi="Courier New"/>
-          <w:sz w:val="18"/>
-        </w:rPr>
-        <w:t>| …  | （行を追加）    | …    | …            | …         |</w:t>
-      </w:r>
-    </w:p>
-    <w:p>
-      <w:pPr/>
-    </w:p>
-    <w:p>
-      <w:pPr/>
-      <w:r>
-        <w:rPr>
-          <w:rFonts w:ascii="Courier New" w:hAnsi="Courier New"/>
-          <w:sz w:val="18"/>
-        </w:rPr>
-        <w:t>━━━━━━━━━━━━━━━━━━━━━━━━━━━━━━</w:t>
-      </w:r>
-    </w:p>
-    <w:p>
-      <w:pPr/>
-      <w:r>
-        <w:rPr>
-          <w:rFonts w:ascii="Courier New" w:hAnsi="Courier New"/>
-          <w:sz w:val="18"/>
-        </w:rPr>
-        <w:t>【第３部：面談の実施状況】</w:t>
-      </w:r>
-    </w:p>
-    <w:p>
-      <w:pPr/>
-      <w:r>
-        <w:rPr>
-          <w:rFonts w:ascii="Courier New" w:hAnsi="Courier New"/>
-          <w:sz w:val="18"/>
-        </w:rPr>
-        <w:t>━━━━━━━━━━━━━━━━━━━━━━━━━━━━━━</w:t>
-      </w:r>
-    </w:p>
-    <w:p>
-      <w:pPr/>
-    </w:p>
-    <w:p>
-      <w:pPr/>
-      <w:r>
-        <w:rPr>
-          <w:rFonts w:ascii="Courier New" w:hAnsi="Courier New"/>
-          <w:sz w:val="18"/>
-        </w:rPr>
-        <w:t>面談開始時刻：[開始時刻]　　面談終了時刻：[終了時刻]</w:t>
-      </w:r>
-    </w:p>
-    <w:p>
-      <w:pPr/>
-      <w:r>
-        <w:rPr>
-          <w:rFonts w:ascii="Courier New" w:hAnsi="Courier New"/>
-          <w:sz w:val="18"/>
-        </w:rPr>
-        <w:t>所要時間    ：約 [所要時間] 分</w:t>
-      </w:r>
-    </w:p>
-    <w:p>
-      <w:pPr/>
-      <w:r>
-        <w:rPr>
-          <w:rFonts w:ascii="Courier New" w:hAnsi="Courier New"/>
-          <w:sz w:val="18"/>
-        </w:rPr>
-        <w:t>実施場所    ：[面談実施場所]</w:t>
-      </w:r>
-    </w:p>
-    <w:p>
-      <w:pPr/>
-      <w:r>
-        <w:rPr>
-          <w:rFonts w:ascii="Courier New" w:hAnsi="Courier New"/>
-          <w:sz w:val="18"/>
-        </w:rPr>
-        <w:t xml:space="preserve">              （例：受入機関事業所内 / 当機関事務所 / オンライン）</w:t>
-      </w:r>
-    </w:p>
-    <w:p>
-      <w:pPr/>
-      <w:r>
-        <w:rPr>
-          <w:rFonts w:ascii="Courier New" w:hAnsi="Courier New"/>
-          <w:sz w:val="18"/>
-        </w:rPr>
-        <w:t>実施方法    ：□ 対面  □ オンライン（[使用ツール]）  □ 電話</w:t>
-      </w:r>
-    </w:p>
-    <w:p>
-      <w:pPr/>
-    </w:p>
-    <w:p>
-      <w:pPr/>
-      <w:r>
-        <w:rPr>
-          <w:rFonts w:ascii="Courier New" w:hAnsi="Courier New"/>
-          <w:sz w:val="18"/>
-        </w:rPr>
-        <w:t>━━━━━━━━━━━━━━━━━━━━━━━━━━━━━━</w:t>
-      </w:r>
-    </w:p>
-    <w:p>
-      <w:pPr/>
-      <w:r>
-        <w:rPr>
-          <w:rFonts w:ascii="Courier New" w:hAnsi="Courier New"/>
-          <w:sz w:val="18"/>
-        </w:rPr>
-        <w:t>【第４部：面談内容（監督者への確認事項）】</w:t>
-      </w:r>
-    </w:p>
-    <w:p>
-      <w:pPr/>
-      <w:r>
-        <w:rPr>
-          <w:rFonts w:ascii="Courier New" w:hAnsi="Courier New"/>
-          <w:sz w:val="18"/>
-        </w:rPr>
-        <w:t>━━━━━━━━━━━━━━━━━━━━━━━━━━━━━━</w:t>
-      </w:r>
-    </w:p>
-    <w:p>
-      <w:pPr/>
-    </w:p>
-    <w:p>
-      <w:pPr/>
-      <w:r>
-        <w:rPr>
-          <w:rFonts w:ascii="Courier New" w:hAnsi="Courier New"/>
-          <w:sz w:val="18"/>
-        </w:rPr>
-        <w:t>────────────────────────────────</w:t>
-      </w:r>
-    </w:p>
-    <w:p>
-      <w:pPr/>
-      <w:r>
-        <w:rPr>
-          <w:rFonts w:ascii="Courier New" w:hAnsi="Courier New"/>
-          <w:sz w:val="18"/>
-        </w:rPr>
-        <w:t>（１）外国人の就労状況の確認</w:t>
-      </w:r>
-    </w:p>
-    <w:p>
-      <w:pPr/>
-      <w:r>
-        <w:rPr>
-          <w:rFonts w:ascii="Courier New" w:hAnsi="Courier New"/>
-          <w:sz w:val="18"/>
-        </w:rPr>
-        <w:t>────────────────────────────────</w:t>
-      </w:r>
-    </w:p>
-    <w:p>
-      <w:pPr/>
-      <w:r>
-        <w:rPr>
-          <w:rFonts w:ascii="Courier New" w:hAnsi="Courier New"/>
-          <w:sz w:val="18"/>
-        </w:rPr>
-        <w:t xml:space="preserve">  Ａ．業務内容・職場適応</w:t>
-      </w:r>
-    </w:p>
-    <w:p>
-      <w:pPr/>
-      <w:r>
-        <w:rPr>
-          <w:rFonts w:ascii="Courier New" w:hAnsi="Courier New"/>
-          <w:sz w:val="18"/>
-        </w:rPr>
-        <w:t xml:space="preserve">    雇用契約書と実際の業務の整合性：□ 整合している  □ 相違あり（[内容]）</w:t>
-      </w:r>
-    </w:p>
-    <w:p>
-      <w:pPr/>
-      <w:r>
-        <w:rPr>
-          <w:rFonts w:ascii="Courier New" w:hAnsi="Courier New"/>
-          <w:sz w:val="18"/>
-        </w:rPr>
-        <w:t xml:space="preserve">    業務習熟度・適応状況          ：□ 良好  □ 普通  □ 課題あり（[内容]）</w:t>
-      </w:r>
-    </w:p>
-    <w:p>
-      <w:pPr/>
-      <w:r>
-        <w:rPr>
-          <w:rFonts w:ascii="Courier New" w:hAnsi="Courier New"/>
-          <w:sz w:val="18"/>
-        </w:rPr>
-        <w:t xml:space="preserve">    特定技能の技術水準の確認      ：□ 問題なし  □ 指導中（[内容]）</w:t>
-      </w:r>
-    </w:p>
-    <w:p>
-      <w:pPr/>
-    </w:p>
-    <w:p>
-      <w:pPr/>
-      <w:r>
-        <w:rPr>
-          <w:rFonts w:ascii="Courier New" w:hAnsi="Courier New"/>
-          <w:sz w:val="18"/>
-        </w:rPr>
-        <w:t xml:space="preserve">  Ｂ．労働時間・休日</w:t>
-      </w:r>
-    </w:p>
-    <w:p>
-      <w:pPr/>
-      <w:r>
-        <w:rPr>
-          <w:rFonts w:ascii="Courier New" w:hAnsi="Courier New"/>
-          <w:sz w:val="18"/>
-        </w:rPr>
-        <w:t xml:space="preserve">    所定内労働時間の遵守          ：□ 遵守  □ 超過（月平均 [月平均超過時間] 時間）</w:t>
-      </w:r>
-    </w:p>
-    <w:p>
-      <w:pPr/>
-      <w:r>
-        <w:rPr>
-          <w:rFonts w:ascii="Courier New" w:hAnsi="Courier New"/>
-          <w:sz w:val="18"/>
-        </w:rPr>
-        <w:t xml:space="preserve">    時間外労働命令の有無と上限    ：□ 協定内  □ 協定超（[詳細]）</w:t>
-      </w:r>
-    </w:p>
-    <w:p>
-      <w:pPr/>
-      <w:r>
-        <w:rPr>
-          <w:rFonts w:ascii="Courier New" w:hAnsi="Courier New"/>
-          <w:sz w:val="18"/>
-        </w:rPr>
-        <w:t xml:space="preserve">    休日・有給休暇の取得状況      ：□ 適切に取得  □ 取得困難（理由：[理由]）</w:t>
-      </w:r>
-    </w:p>
-    <w:p>
-      <w:pPr/>
-    </w:p>
-    <w:p>
-      <w:pPr/>
-      <w:r>
-        <w:rPr>
-          <w:rFonts w:ascii="Courier New" w:hAnsi="Courier New"/>
-          <w:sz w:val="18"/>
-        </w:rPr>
-        <w:t xml:space="preserve">  Ｃ．賃金支払い状況</w:t>
-      </w:r>
-    </w:p>
-    <w:p>
-      <w:pPr/>
-      <w:r>
-        <w:rPr>
-          <w:rFonts w:ascii="Courier New" w:hAnsi="Courier New"/>
-          <w:sz w:val="18"/>
-        </w:rPr>
-        <w:t xml:space="preserve">    賃金の遅延・未払いの有無      ：□ なし  □ あり（[詳細]）</w:t>
-      </w:r>
-    </w:p>
-    <w:p>
-      <w:pPr/>
-      <w:r>
-        <w:rPr>
-          <w:rFonts w:ascii="Courier New" w:hAnsi="Courier New"/>
-          <w:sz w:val="18"/>
-        </w:rPr>
-        <w:t xml:space="preserve">    最低賃金以上の支払い          ：□ 確認済  □ 要確認</w:t>
-      </w:r>
-    </w:p>
-    <w:p>
-      <w:pPr/>
-      <w:r>
-        <w:rPr>
-          <w:rFonts w:ascii="Courier New" w:hAnsi="Courier New"/>
-          <w:sz w:val="18"/>
-        </w:rPr>
-        <w:t xml:space="preserve">    給与明細の交付                ：□ 実施  □ 未実施（理由：[理由]）</w:t>
-      </w:r>
-    </w:p>
-    <w:p>
-      <w:pPr/>
-      <w:r>
-        <w:rPr>
-          <w:rFonts w:ascii="Courier New" w:hAnsi="Courier New"/>
-          <w:sz w:val="18"/>
-        </w:rPr>
-        <w:t xml:space="preserve">    不当控除の有無                ：□ なし  □ あり（[詳細]）</w:t>
-      </w:r>
-    </w:p>
-    <w:p>
-      <w:pPr/>
-    </w:p>
-    <w:p>
-      <w:pPr/>
-      <w:r>
-        <w:rPr>
-          <w:rFonts w:ascii="Courier New" w:hAnsi="Courier New"/>
-          <w:sz w:val="18"/>
-        </w:rPr>
-        <w:t xml:space="preserve">  Ｄ．社会保険・労働保険</w:t>
-      </w:r>
-    </w:p>
-    <w:p>
-      <w:pPr/>
-      <w:r>
-        <w:rPr>
-          <w:rFonts w:ascii="Courier New" w:hAnsi="Courier New"/>
-          <w:sz w:val="18"/>
-        </w:rPr>
-        <w:t xml:space="preserve">    健康保険        ：□ 加入済  □ 未加入（理由：[理由]）</w:t>
-      </w:r>
-    </w:p>
-    <w:p>
-      <w:pPr/>
-      <w:r>
-        <w:rPr>
-          <w:rFonts w:ascii="Courier New" w:hAnsi="Courier New"/>
-          <w:sz w:val="18"/>
-        </w:rPr>
-        <w:t xml:space="preserve">    厚生年金        ：□ 加入済  □ 未加入（理由：[理由]）</w:t>
-      </w:r>
-    </w:p>
-    <w:p>
-      <w:pPr/>
-      <w:r>
-        <w:rPr>
-          <w:rFonts w:ascii="Courier New" w:hAnsi="Courier New"/>
-          <w:sz w:val="18"/>
-        </w:rPr>
-        <w:t xml:space="preserve">    雇用保険        ：□ 加入済  □ 未加入（理由：[理由]）</w:t>
-      </w:r>
-    </w:p>
-    <w:p>
-      <w:pPr/>
-      <w:r>
-        <w:rPr>
-          <w:rFonts w:ascii="Courier New" w:hAnsi="Courier New"/>
-          <w:sz w:val="18"/>
-        </w:rPr>
-        <w:t xml:space="preserve">    労災保険        ：□ 加入済  □ 未加入（理由：[理由]）</w:t>
-      </w:r>
-    </w:p>
-    <w:p>
-      <w:pPr/>
-    </w:p>
-    <w:p>
-      <w:pPr/>
-      <w:r>
-        <w:rPr>
-          <w:rFonts w:ascii="Courier New" w:hAnsi="Courier New"/>
-          <w:sz w:val="18"/>
-        </w:rPr>
-        <w:t>────────────────────────────────</w:t>
-      </w:r>
-    </w:p>
-    <w:p>
-      <w:pPr/>
-      <w:r>
-        <w:rPr>
-          <w:rFonts w:ascii="Courier New" w:hAnsi="Courier New"/>
-          <w:sz w:val="18"/>
-        </w:rPr>
-        <w:t>（２）職場環境・人権侵害等の確認</w:t>
-      </w:r>
-    </w:p>
-    <w:p>
-      <w:pPr/>
-      <w:r>
-        <w:rPr>
-          <w:rFonts w:ascii="Courier New" w:hAnsi="Courier New"/>
-          <w:sz w:val="18"/>
-        </w:rPr>
-        <w:t>────────────────────────────────</w:t>
-      </w:r>
-    </w:p>
-    <w:p>
-      <w:pPr/>
-      <w:r>
-        <w:rPr>
-          <w:rFonts w:ascii="Courier New" w:hAnsi="Courier New"/>
-          <w:sz w:val="18"/>
-        </w:rPr>
-        <w:t xml:space="preserve">  Ａ．職場環境</w:t>
-      </w:r>
-    </w:p>
-    <w:p>
-      <w:pPr/>
-      <w:r>
-        <w:rPr>
-          <w:rFonts w:ascii="Courier New" w:hAnsi="Courier New"/>
-          <w:sz w:val="18"/>
-        </w:rPr>
-        <w:t xml:space="preserve">    安全衛生体制の整備            ：□ 整備済  □ 未整備・要改善（[内容]）</w:t>
-      </w:r>
-    </w:p>
-    <w:p>
-      <w:pPr/>
-      <w:r>
-        <w:rPr>
-          <w:rFonts w:ascii="Courier New" w:hAnsi="Courier New"/>
-          <w:sz w:val="18"/>
-        </w:rPr>
-        <w:t xml:space="preserve">    危険作業等への適切な教育・指導：□ 実施済  □ 未実施（[内容]）</w:t>
-      </w:r>
-    </w:p>
-    <w:p>
-      <w:pPr/>
-    </w:p>
-    <w:p>
-      <w:pPr/>
-      <w:r>
-        <w:rPr>
-          <w:rFonts w:ascii="Courier New" w:hAnsi="Courier New"/>
-          <w:sz w:val="18"/>
-        </w:rPr>
-        <w:t xml:space="preserve">  Ｂ．ハラスメント・人権侵害</w:t>
-      </w:r>
-    </w:p>
-    <w:p>
-      <w:pPr/>
-      <w:r>
-        <w:rPr>
-          <w:rFonts w:ascii="Courier New" w:hAnsi="Courier New"/>
-          <w:sz w:val="18"/>
-        </w:rPr>
-        <w:t xml:space="preserve">    ハラスメント行為の有無        ：□ なし  □ あり（[内容]）</w:t>
-      </w:r>
-    </w:p>
-    <w:p>
-      <w:pPr/>
-      <w:r>
-        <w:rPr>
-          <w:rFonts w:ascii="Courier New" w:hAnsi="Courier New"/>
-          <w:sz w:val="18"/>
-        </w:rPr>
-        <w:t xml:space="preserve">    外国人のパスポート・在留カードの保管：</w:t>
-      </w:r>
-    </w:p>
-    <w:p>
-      <w:pPr/>
-      <w:r>
-        <w:rPr>
-          <w:rFonts w:ascii="Courier New" w:hAnsi="Courier New"/>
-          <w:sz w:val="18"/>
-        </w:rPr>
-        <w:t xml:space="preserve">      □ 本人管理（問題なし）</w:t>
-      </w:r>
-    </w:p>
-    <w:p>
-      <w:pPr/>
-      <w:r>
-        <w:rPr>
-          <w:rFonts w:ascii="Courier New" w:hAnsi="Courier New"/>
-          <w:sz w:val="18"/>
-        </w:rPr>
-        <w:t xml:space="preserve">      □ 機関管理（本人同意：□あり □なし）</w:t>
-      </w:r>
-    </w:p>
-    <w:p>
-      <w:pPr/>
-      <w:r>
-        <w:rPr>
-          <w:rFonts w:ascii="Courier New" w:hAnsi="Courier New"/>
-          <w:sz w:val="18"/>
-        </w:rPr>
-        <w:t xml:space="preserve">      □ 強制的な取り上げ（→ 要対応）</w:t>
-      </w:r>
-    </w:p>
-    <w:p>
-      <w:pPr/>
-      <w:r>
-        <w:rPr>
-          <w:rFonts w:ascii="Courier New" w:hAnsi="Courier New"/>
-          <w:sz w:val="18"/>
-        </w:rPr>
-        <w:t xml:space="preserve">    不当な金銭徴収                ：□ なし  □ あり（[詳細]）</w:t>
-      </w:r>
-    </w:p>
-    <w:p>
-      <w:pPr/>
-      <w:r>
-        <w:rPr>
-          <w:rFonts w:ascii="Courier New" w:hAnsi="Courier New"/>
-          <w:sz w:val="18"/>
-        </w:rPr>
-        <w:t xml:space="preserve">    外出・通信等の不当な制限      ：□ なし  □ あり（[詳細]）</w:t>
-      </w:r>
-    </w:p>
-    <w:p>
-      <w:pPr/>
-      <w:r>
-        <w:rPr>
-          <w:rFonts w:ascii="Courier New" w:hAnsi="Courier New"/>
-          <w:sz w:val="18"/>
-        </w:rPr>
-        <w:t xml:space="preserve">    強制貯蓄・違約金の設定        ：□ なし  □ あり（[詳細]）</w:t>
-      </w:r>
-    </w:p>
-    <w:p>
-      <w:pPr/>
-    </w:p>
-    <w:p>
-      <w:pPr/>
-      <w:r>
-        <w:rPr>
-          <w:rFonts w:ascii="Courier New" w:hAnsi="Courier New"/>
-          <w:sz w:val="18"/>
-        </w:rPr>
-        <w:t xml:space="preserve">  Ｃ．外国人本人からの苦情・相談</w:t>
-      </w:r>
-    </w:p>
-    <w:p>
-      <w:pPr/>
-      <w:r>
-        <w:rPr>
-          <w:rFonts w:ascii="Courier New" w:hAnsi="Courier New"/>
-          <w:sz w:val="18"/>
-        </w:rPr>
-        <w:t xml:space="preserve">    受入機関で把握している苦情・相談：[苦情相談内容]</w:t>
-      </w:r>
-    </w:p>
-    <w:p>
-      <w:pPr/>
-      <w:r>
-        <w:rPr>
-          <w:rFonts w:ascii="Courier New" w:hAnsi="Courier New"/>
-          <w:sz w:val="18"/>
-        </w:rPr>
-        <w:t xml:space="preserve">                                      ※ なければ「特になし」</w:t>
-      </w:r>
-    </w:p>
-    <w:p>
-      <w:pPr/>
-      <w:r>
-        <w:rPr>
-          <w:rFonts w:ascii="Courier New" w:hAnsi="Courier New"/>
-          <w:sz w:val="18"/>
-        </w:rPr>
-        <w:t xml:space="preserve">    当機関（登録支援機関）への相談についての認識：</w:t>
-      </w:r>
-    </w:p>
-    <w:p>
-      <w:pPr/>
-      <w:r>
-        <w:rPr>
-          <w:rFonts w:ascii="Courier New" w:hAnsi="Courier New"/>
-          <w:sz w:val="18"/>
-        </w:rPr>
-        <w:t xml:space="preserve">      □ 認識あり（相談窓口を外国人に案内している）</w:t>
-      </w:r>
-    </w:p>
-    <w:p>
-      <w:pPr/>
-      <w:r>
-        <w:rPr>
-          <w:rFonts w:ascii="Courier New" w:hAnsi="Courier New"/>
-          <w:sz w:val="18"/>
-        </w:rPr>
-        <w:t xml:space="preserve">      □ 認識なし（→ 改めて案内するよう指導）</w:t>
-      </w:r>
-    </w:p>
-    <w:p>
-      <w:pPr/>
-    </w:p>
-    <w:p>
-      <w:pPr/>
-      <w:r>
-        <w:rPr>
-          <w:rFonts w:ascii="Courier New" w:hAnsi="Courier New"/>
-          <w:sz w:val="18"/>
-        </w:rPr>
-        <w:t>────────────────────────────────</w:t>
-      </w:r>
-    </w:p>
-    <w:p>
-      <w:pPr/>
-      <w:r>
-        <w:rPr>
-          <w:rFonts w:ascii="Courier New" w:hAnsi="Courier New"/>
-          <w:sz w:val="18"/>
-        </w:rPr>
-        <w:t>（３）支援の実施状況の確認</w:t>
-      </w:r>
-    </w:p>
-    <w:p>
-      <w:pPr/>
-      <w:r>
-        <w:rPr>
-          <w:rFonts w:ascii="Courier New" w:hAnsi="Courier New"/>
-          <w:sz w:val="18"/>
-        </w:rPr>
-        <w:t>────────────────────────────────</w:t>
-      </w:r>
-    </w:p>
-    <w:p>
-      <w:pPr/>
-      <w:r>
-        <w:rPr>
-          <w:rFonts w:ascii="Courier New" w:hAnsi="Courier New"/>
-          <w:sz w:val="18"/>
-        </w:rPr>
-        <w:t xml:space="preserve">  事前ガイダンス実施後の問題有無    ：□ なし  □ あり（[内容]）</w:t>
-      </w:r>
-    </w:p>
-    <w:p>
-      <w:pPr/>
-      <w:r>
-        <w:rPr>
-          <w:rFonts w:ascii="Courier New" w:hAnsi="Courier New"/>
-          <w:sz w:val="18"/>
-        </w:rPr>
-        <w:t xml:space="preserve">  生活オリエンテーション後の問題有無：□ なし  □ あり（[内容]）</w:t>
-      </w:r>
-    </w:p>
-    <w:p>
-      <w:pPr/>
-      <w:r>
-        <w:rPr>
-          <w:rFonts w:ascii="Courier New" w:hAnsi="Courier New"/>
-          <w:sz w:val="18"/>
-        </w:rPr>
-        <w:t xml:space="preserve">  日本語学習への取り組み           ：□ 積極的  □ 普通  □ 消極的</w:t>
-      </w:r>
-    </w:p>
-    <w:p>
-      <w:pPr/>
-      <w:r>
-        <w:rPr>
-          <w:rFonts w:ascii="Courier New" w:hAnsi="Courier New"/>
-          <w:sz w:val="18"/>
-        </w:rPr>
-        <w:t xml:space="preserve">  公的手続き（役所・保険等）の完了  ：□ 完了  □ 未完了（[内容]）</w:t>
-      </w:r>
-    </w:p>
-    <w:p>
-      <w:pPr/>
-    </w:p>
-    <w:p>
-      <w:pPr/>
-      <w:r>
-        <w:rPr>
-          <w:rFonts w:ascii="Courier New" w:hAnsi="Courier New"/>
-          <w:sz w:val="18"/>
-        </w:rPr>
-        <w:t>────────────────────────────────</w:t>
-      </w:r>
-    </w:p>
-    <w:p>
-      <w:pPr/>
-      <w:r>
-        <w:rPr>
-          <w:rFonts w:ascii="Courier New" w:hAnsi="Courier New"/>
-          <w:sz w:val="18"/>
-        </w:rPr>
-        <w:t>（４）今後の雇用継続・就労環境についての意向</w:t>
-      </w:r>
-    </w:p>
-    <w:p>
-      <w:pPr/>
-      <w:r>
-        <w:rPr>
-          <w:rFonts w:ascii="Courier New" w:hAnsi="Courier New"/>
-          <w:sz w:val="18"/>
-        </w:rPr>
-        <w:t>────────────────────────────────</w:t>
-      </w:r>
-    </w:p>
-    <w:p>
-      <w:pPr/>
-      <w:r>
-        <w:rPr>
-          <w:rFonts w:ascii="Courier New" w:hAnsi="Courier New"/>
-          <w:sz w:val="18"/>
-        </w:rPr>
-        <w:t xml:space="preserve">  今後の雇用継続予定：</w:t>
-      </w:r>
-    </w:p>
-    <w:p>
-      <w:pPr/>
-      <w:r>
-        <w:rPr>
-          <w:rFonts w:ascii="Courier New" w:hAnsi="Courier New"/>
-          <w:sz w:val="18"/>
-        </w:rPr>
-        <w:t xml:space="preserve">    □ 継続雇用予定</w:t>
-      </w:r>
-    </w:p>
-    <w:p>
-      <w:pPr/>
-      <w:r>
-        <w:rPr>
-          <w:rFonts w:ascii="Courier New" w:hAnsi="Courier New"/>
-          <w:sz w:val="18"/>
-        </w:rPr>
-        <w:t xml:space="preserve">    □ 契約満了後の更新検討中</w:t>
-      </w:r>
-    </w:p>
-    <w:p>
-      <w:pPr/>
-      <w:r>
-        <w:rPr>
-          <w:rFonts w:ascii="Courier New" w:hAnsi="Courier New"/>
-          <w:sz w:val="18"/>
-        </w:rPr>
-        <w:t xml:space="preserve">    □ 雇用終了の予定あり（理由：[理由]、終了予定日：令和[年]年[月]月[日]日）</w:t>
-      </w:r>
-    </w:p>
-    <w:p>
-      <w:pPr/>
-    </w:p>
-    <w:p>
-      <w:pPr/>
-      <w:r>
-        <w:rPr>
-          <w:rFonts w:ascii="Courier New" w:hAnsi="Courier New"/>
-          <w:sz w:val="18"/>
-        </w:rPr>
-        <w:t xml:space="preserve">  受入機関からの特記事項・要望：</w:t>
-      </w:r>
-    </w:p>
-    <w:p>
-      <w:pPr/>
-      <w:r>
-        <w:rPr>
-          <w:rFonts w:ascii="Courier New" w:hAnsi="Courier New"/>
-          <w:sz w:val="18"/>
-        </w:rPr>
-        <w:t xml:space="preserve">    [受入機関特記事項要望]</w:t>
-      </w:r>
-    </w:p>
-    <w:p>
-      <w:pPr/>
-      <w:r>
-        <w:rPr>
-          <w:rFonts w:ascii="Courier New" w:hAnsi="Courier New"/>
-          <w:sz w:val="18"/>
-        </w:rPr>
-        <w:t xml:space="preserve">    ※ なければ「特になし」と記入</w:t>
-      </w:r>
-    </w:p>
-    <w:p>
-      <w:pPr/>
-    </w:p>
-    <w:p>
-      <w:pPr/>
-      <w:r>
-        <w:rPr>
-          <w:rFonts w:ascii="Courier New" w:hAnsi="Courier New"/>
-          <w:sz w:val="18"/>
-        </w:rPr>
-        <w:t>━━━━━━━━━━━━━━━━━━━━━━━━━━━━━━</w:t>
-      </w:r>
-    </w:p>
-    <w:p>
-      <w:pPr/>
-      <w:r>
-        <w:rPr>
-          <w:rFonts w:ascii="Courier New" w:hAnsi="Courier New"/>
-          <w:sz w:val="18"/>
-        </w:rPr>
-        <w:t>【第５部：面談担当者の所見・対応方針】</w:t>
-      </w:r>
-    </w:p>
-    <w:p>
-      <w:pPr/>
-      <w:r>
-        <w:rPr>
-          <w:rFonts w:ascii="Courier New" w:hAnsi="Courier New"/>
-          <w:sz w:val="18"/>
-        </w:rPr>
-        <w:t>━━━━━━━━━━━━━━━━━━━━━━━━━━━━━━</w:t>
-      </w:r>
-    </w:p>
-    <w:p>
-      <w:pPr/>
-    </w:p>
-    <w:p>
-      <w:pPr/>
-      <w:r>
-        <w:rPr>
-          <w:rFonts w:ascii="Courier New" w:hAnsi="Courier New"/>
-          <w:sz w:val="18"/>
-        </w:rPr>
-        <w:t>────────────────────────────────</w:t>
-      </w:r>
-    </w:p>
-    <w:p>
-      <w:pPr/>
-      <w:r>
-        <w:rPr>
-          <w:rFonts w:ascii="Courier New" w:hAnsi="Courier New"/>
-          <w:sz w:val="18"/>
-        </w:rPr>
-        <w:t>（１）総合所見</w:t>
-      </w:r>
-    </w:p>
-    <w:p>
-      <w:pPr/>
-      <w:r>
-        <w:rPr>
-          <w:rFonts w:ascii="Courier New" w:hAnsi="Courier New"/>
-          <w:sz w:val="18"/>
-        </w:rPr>
-        <w:t>────────────────────────────────</w:t>
-      </w:r>
-    </w:p>
-    <w:p>
-      <w:pPr/>
-      <w:r>
-        <w:rPr>
-          <w:rFonts w:ascii="Courier New" w:hAnsi="Courier New"/>
-          <w:sz w:val="18"/>
-        </w:rPr>
-        <w:t xml:space="preserve">  [面談担当者所見]</w:t>
-      </w:r>
-    </w:p>
-    <w:p>
-      <w:pPr/>
-      <w:r>
-        <w:rPr>
-          <w:rFonts w:ascii="Courier New" w:hAnsi="Courier New"/>
-          <w:sz w:val="18"/>
-        </w:rPr>
-        <w:t xml:space="preserve">  （例：受入機関における就労環境は適切に整備されており、</w:t>
-      </w:r>
-    </w:p>
-    <w:p>
-      <w:pPr/>
-      <w:r>
-        <w:rPr>
-          <w:rFonts w:ascii="Courier New" w:hAnsi="Courier New"/>
-          <w:sz w:val="18"/>
-        </w:rPr>
-        <w:t xml:space="preserve">   法令違反・人権侵害等の問題は認められなかった。</w:t>
-      </w:r>
-    </w:p>
-    <w:p>
-      <w:pPr/>
-      <w:r>
-        <w:rPr>
-          <w:rFonts w:ascii="Courier New" w:hAnsi="Courier New"/>
-          <w:sz w:val="18"/>
-        </w:rPr>
-        <w:t xml:space="preserve">   監督者は外国人との意思疎通に積極的に取り組んでいる。）</w:t>
-      </w:r>
-    </w:p>
-    <w:p>
-      <w:pPr/>
-    </w:p>
-    <w:p>
-      <w:pPr/>
-      <w:r>
-        <w:rPr>
-          <w:rFonts w:ascii="Courier New" w:hAnsi="Courier New"/>
-          <w:sz w:val="18"/>
-        </w:rPr>
-        <w:t>────────────────────────────────</w:t>
-      </w:r>
-    </w:p>
-    <w:p>
-      <w:pPr/>
-      <w:r>
-        <w:rPr>
-          <w:rFonts w:ascii="Courier New" w:hAnsi="Courier New"/>
-          <w:sz w:val="18"/>
-        </w:rPr>
-        <w:t>（２）問題事案・指導事項</w:t>
-      </w:r>
-    </w:p>
-    <w:p>
-      <w:pPr/>
-      <w:r>
-        <w:rPr>
-          <w:rFonts w:ascii="Courier New" w:hAnsi="Courier New"/>
-          <w:sz w:val="18"/>
-        </w:rPr>
-        <w:t>────────────────────────────────</w:t>
-      </w:r>
-    </w:p>
-    <w:p>
-      <w:pPr/>
-      <w:r>
-        <w:rPr>
-          <w:rFonts w:ascii="Courier New" w:hAnsi="Courier New"/>
-          <w:sz w:val="18"/>
-        </w:rPr>
-        <w:t xml:space="preserve">  □ 問題事案・指導事項なし</w:t>
-      </w:r>
-    </w:p>
-    <w:p>
-      <w:pPr/>
-      <w:r>
-        <w:rPr>
-          <w:rFonts w:ascii="Courier New" w:hAnsi="Courier New"/>
-          <w:sz w:val="18"/>
-        </w:rPr>
-        <w:t xml:space="preserve">  □ あり（以下に詳記）</w:t>
-      </w:r>
-    </w:p>
-    <w:p>
-      <w:pPr/>
-    </w:p>
-    <w:p>
-      <w:pPr/>
-      <w:r>
-        <w:rPr>
-          <w:rFonts w:ascii="Courier New" w:hAnsi="Courier New"/>
-          <w:sz w:val="18"/>
-        </w:rPr>
-        <w:t xml:space="preserve">  | No | 事案の内容 | 緊急度 | 対応・指導内容 | 対応期限 |</w:t>
-      </w:r>
-    </w:p>
-    <w:p>
-      <w:pPr/>
-      <w:r>
-        <w:rPr>
-          <w:rFonts w:ascii="Courier New" w:hAnsi="Courier New"/>
-          <w:sz w:val="18"/>
-        </w:rPr>
-        <w:t xml:space="preserve">  |----|----------|--------|--------------|---------|</w:t>
-      </w:r>
-    </w:p>
-    <w:p>
-      <w:pPr/>
-      <w:r>
-        <w:rPr>
-          <w:rFonts w:ascii="Courier New" w:hAnsi="Courier New"/>
-          <w:sz w:val="18"/>
-        </w:rPr>
-        <w:t xml:space="preserve">  | 1  | [事案内容_1] | □高□中□低 | [対応指導内容_1] | 令和[年]年[月]月[日]日 |</w:t>
-      </w:r>
-    </w:p>
-    <w:p>
-      <w:pPr/>
-      <w:r>
-        <w:rPr>
-          <w:rFonts w:ascii="Courier New" w:hAnsi="Courier New"/>
-          <w:sz w:val="18"/>
-        </w:rPr>
-        <w:t xml:space="preserve">  | 2  | [事案内容_2] | □高□中□低 | [対応指導内容_2] | 令和[年]年[月]月[日]日 |</w:t>
-      </w:r>
-    </w:p>
-    <w:p>
-      <w:pPr/>
-    </w:p>
-    <w:p>
-      <w:pPr/>
-      <w:r>
-        <w:rPr>
-          <w:rFonts w:ascii="Courier New" w:hAnsi="Courier New"/>
-          <w:sz w:val="18"/>
-        </w:rPr>
-        <w:t>────────────────────────────────</w:t>
-      </w:r>
-    </w:p>
-    <w:p>
-      <w:pPr/>
-      <w:r>
-        <w:rPr>
-          <w:rFonts w:ascii="Courier New" w:hAnsi="Courier New"/>
-          <w:sz w:val="18"/>
-        </w:rPr>
-        <w:t>（３）行政機関への通報・連絡の要否</w:t>
-      </w:r>
-    </w:p>
-    <w:p>
-      <w:pPr/>
-      <w:r>
-        <w:rPr>
-          <w:rFonts w:ascii="Courier New" w:hAnsi="Courier New"/>
-          <w:sz w:val="18"/>
-        </w:rPr>
-        <w:t>────────────────────────────────</w:t>
-      </w:r>
-    </w:p>
-    <w:p>
-      <w:pPr/>
-      <w:r>
-        <w:rPr>
-          <w:rFonts w:ascii="Courier New" w:hAnsi="Courier New"/>
-          <w:sz w:val="18"/>
-        </w:rPr>
-        <w:t xml:space="preserve">  □ 不要</w:t>
-      </w:r>
-    </w:p>
-    <w:p>
-      <w:pPr/>
-      <w:r>
-        <w:rPr>
-          <w:rFonts w:ascii="Courier New" w:hAnsi="Courier New"/>
-          <w:sz w:val="18"/>
-        </w:rPr>
-        <w:t xml:space="preserve">  □ 必要（連絡先機関名：[通報機関名]、理由：[通報理由]）</w:t>
-      </w:r>
-    </w:p>
-    <w:p>
-      <w:pPr/>
-    </w:p>
-    <w:p>
-      <w:pPr/>
-      <w:r>
-        <w:rPr>
-          <w:rFonts w:ascii="Courier New" w:hAnsi="Courier New"/>
-          <w:sz w:val="18"/>
-        </w:rPr>
-        <w:t>━━━━━━━━━━━━━━━━━━━━━━━━━━━━━━</w:t>
-      </w:r>
-    </w:p>
-    <w:p>
-      <w:pPr/>
-      <w:r>
-        <w:rPr>
-          <w:rFonts w:ascii="Courier New" w:hAnsi="Courier New"/>
-          <w:sz w:val="18"/>
-        </w:rPr>
-        <w:t>【第６部：署名欄】</w:t>
-      </w:r>
-    </w:p>
-    <w:p>
-      <w:pPr/>
-      <w:r>
-        <w:rPr>
-          <w:rFonts w:ascii="Courier New" w:hAnsi="Courier New"/>
-          <w:sz w:val="18"/>
-        </w:rPr>
-        <w:t>━━━━━━━━━━━━━━━━━━━━━━━━━━━━━━</w:t>
-      </w:r>
-    </w:p>
-    <w:p>
-      <w:pPr/>
-    </w:p>
-    <w:p>
-      <w:pPr/>
-      <w:r>
-        <w:rPr>
-          <w:rFonts w:ascii="Courier New" w:hAnsi="Courier New"/>
-          <w:sz w:val="18"/>
-        </w:rPr>
-        <w:t xml:space="preserve">  本面談の内容を確認しました。</w:t>
-      </w:r>
-    </w:p>
-    <w:p>
-      <w:pPr/>
-    </w:p>
-    <w:p>
-      <w:pPr/>
-      <w:r>
-        <w:rPr>
-          <w:rFonts w:ascii="Courier New" w:hAnsi="Courier New"/>
-          <w:sz w:val="18"/>
-        </w:rPr>
-        <w:t xml:space="preserve">  監督者署名  ：____________________</w:t>
-      </w:r>
-    </w:p>
-    <w:p>
-      <w:pPr/>
-      <w:r>
-        <w:rPr>
-          <w:rFonts w:ascii="Courier New" w:hAnsi="Courier New"/>
-          <w:sz w:val="18"/>
-        </w:rPr>
-        <w:t xml:space="preserve">    氏名      ：[監督者氏名]</w:t>
-      </w:r>
-    </w:p>
-    <w:p>
-      <w:pPr/>
-      <w:r>
-        <w:rPr>
-          <w:rFonts w:ascii="Courier New" w:hAnsi="Courier New"/>
-          <w:sz w:val="18"/>
-        </w:rPr>
-        <w:t xml:space="preserve">    役職      ：[監督者役職]</w:t>
-      </w:r>
-    </w:p>
-    <w:p>
-      <w:pPr/>
-      <w:r>
-        <w:rPr>
-          <w:rFonts w:ascii="Courier New" w:hAnsi="Courier New"/>
-          <w:sz w:val="18"/>
-        </w:rPr>
-        <w:t xml:space="preserve">    所属機関  ：[受入機関名]</w:t>
-      </w:r>
-    </w:p>
-    <w:p>
-      <w:pPr/>
-      <w:r>
-        <w:rPr>
-          <w:rFonts w:ascii="Courier New" w:hAnsi="Courier New"/>
-          <w:sz w:val="18"/>
-        </w:rPr>
-        <w:t xml:space="preserve">    日付      ：令和 [署名年] 年 [署名月] 月 [署名日] 日</w:t>
-      </w:r>
-    </w:p>
-    <w:p>
-      <w:pPr/>
-    </w:p>
-    <w:p>
-      <w:pPr/>
-      <w:r>
-        <w:rPr>
-          <w:rFonts w:ascii="Courier New" w:hAnsi="Courier New"/>
-          <w:sz w:val="18"/>
-        </w:rPr>
-        <w:t xml:space="preserve">  面談担当者  ：██ [面談担当者氏名]       ██  （署名または記名押印）</w:t>
-      </w:r>
-    </w:p>
-    <w:p>
-      <w:pPr/>
-      <w:r>
-        <w:rPr>
-          <w:rFonts w:ascii="Courier New" w:hAnsi="Courier New"/>
-          <w:sz w:val="18"/>
-        </w:rPr>
-        <w:t xml:space="preserve">  確認者      ：██ [確認者氏名・役職]      ██  （署名または記名押印）</w:t>
-      </w:r>
-    </w:p>
-    <w:p>
-      <w:pPr/>
-    </w:p>
-    <w:p>
-      <w:pPr/>
-      <w:r>
-        <w:rPr>
-          <w:rFonts w:ascii="Courier New" w:hAnsi="Courier New"/>
-          <w:sz w:val="18"/>
-        </w:rPr>
-        <w:t>━━━━━━━━━━━━━━━━━━━━━━━━━━━━━━</w:t>
+        <w:t>「監督者」＝外国人を直接指揮監督する者（現場責任者・上長等）</w:t>
       </w:r>
     </w:p>
     <w:p/>
     <w:p>
       <w:r>
-        <w:t>────────────────────────────────────────</w:t>
+        <w:rPr>
+          <w:sz w:val="16"/>
+        </w:rPr>
+        <w:t>──────────────────────────────────────────────────</w:t>
       </w:r>
     </w:p>
     <w:p/>
     <w:p>
-      <w:pPr>
-        <w:pStyle w:val="Heading2"/>
-      </w:pPr>
       <w:r>
         <w:rPr>
           <w:b/>
           <w:sz w:val="24"/>
         </w:rPr>
-        <w:t>変数速查表（文件④専用・所要時間目安：約3分）</w:t>
+        <w:t>▌基本情報</w:t>
       </w:r>
     </w:p>
     <w:p/>
@@ -1556,65 +72,35 @@
         <w:tblLook w:firstColumn="1" w:firstRow="1" w:lastColumn="0" w:lastRow="0" w:noHBand="0" w:noVBand="1" w:val="04A0"/>
       </w:tblPr>
       <w:tblGrid>
-        <w:gridCol w:w="2351"/>
-        <w:gridCol w:w="2351"/>
-        <w:gridCol w:w="2351"/>
-        <w:gridCol w:w="2351"/>
+        <w:gridCol w:w="4703"/>
+        <w:gridCol w:w="4703"/>
       </w:tblGrid>
       <w:tr>
         <w:tc>
           <w:tcPr>
-            <w:tcW w:type="dxa" w:w="2351"/>
+            <w:tcW w:type="dxa" w:w="4703"/>
           </w:tcPr>
           <w:p>
             <w:r>
               <w:rPr>
                 <w:b/>
-                <w:sz w:val="18"/>
+                <w:sz w:val="17"/>
               </w:rPr>
-              <w:t>カテゴリ</w:t>
+              <w:t>項目</w:t>
             </w:r>
           </w:p>
         </w:tc>
         <w:tc>
           <w:tcPr>
-            <w:tcW w:type="dxa" w:w="2351"/>
+            <w:tcW w:type="dxa" w:w="4703"/>
           </w:tcPr>
           <w:p>
             <w:r>
               <w:rPr>
                 <w:b/>
-                <w:sz w:val="18"/>
+                <w:sz w:val="17"/>
               </w:rPr>
-              <w:t>変数名</w:t>
-            </w:r>
-          </w:p>
-        </w:tc>
-        <w:tc>
-          <w:tcPr>
-            <w:tcW w:type="dxa" w:w="2351"/>
-          </w:tcPr>
-          <w:p>
-            <w:r>
-              <w:rPr>
-                <w:b/>
-                <w:sz w:val="18"/>
-              </w:rPr>
-              <w:t>記入内容</w:t>
-            </w:r>
-          </w:p>
-        </w:tc>
-        <w:tc>
-          <w:tcPr>
-            <w:tcW w:type="dxa" w:w="2351"/>
-          </w:tcPr>
-          <w:p>
-            <w:r>
-              <w:rPr>
-                <w:b/>
-                <w:sz w:val="18"/>
-              </w:rPr>
-              <w:t>入力例</w:t>
+              <w:t>内容</w:t>
             </w:r>
           </w:p>
         </w:tc>
@@ -1622,53 +108,27 @@
       <w:tr>
         <w:tc>
           <w:tcPr>
-            <w:tcW w:type="dxa" w:w="2351"/>
+            <w:tcW w:type="dxa" w:w="4703"/>
           </w:tcPr>
           <w:p>
             <w:r>
               <w:rPr>
-                <w:sz w:val="18"/>
+                <w:sz w:val="17"/>
               </w:rPr>
-              <w:t>**★面談ごと**</w:t>
+              <w:t>報告書番号</w:t>
             </w:r>
           </w:p>
         </w:tc>
         <w:tc>
           <w:tcPr>
-            <w:tcW w:type="dxa" w:w="2351"/>
+            <w:tcW w:type="dxa" w:w="4703"/>
           </w:tcPr>
           <w:p>
             <w:r>
               <w:rPr>
-                <w:sz w:val="18"/>
+                <w:sz w:val="17"/>
               </w:rPr>
-              <w:t>`[報告書番号]`</w:t>
-            </w:r>
-          </w:p>
-        </w:tc>
-        <w:tc>
-          <w:tcPr>
-            <w:tcW w:type="dxa" w:w="2351"/>
-          </w:tcPr>
-          <w:p>
-            <w:r>
-              <w:rPr>
-                <w:sz w:val="18"/>
-              </w:rPr>
-              <w:t>管理用番号</w:t>
-            </w:r>
-          </w:p>
-        </w:tc>
-        <w:tc>
-          <w:tcPr>
-            <w:tcW w:type="dxa" w:w="2351"/>
-          </w:tcPr>
-          <w:p>
-            <w:r>
-              <w:rPr>
-                <w:sz w:val="18"/>
-              </w:rPr>
-              <w:t>2025-Q2-SUP-001</w:t>
+              <w:t>**[報告書番号]**（例：2025-Q2-SUP-001）</w:t>
             </w:r>
           </w:p>
         </w:tc>
@@ -1676,37 +136,12 @@
       <w:tr>
         <w:tc>
           <w:tcPr>
-            <w:tcW w:type="dxa" w:w="2351"/>
+            <w:tcW w:type="dxa" w:w="4703"/>
           </w:tcPr>
           <w:p>
             <w:r>
               <w:rPr>
-                <w:sz w:val="18"/>
-              </w:rPr>
-            </w:r>
-          </w:p>
-        </w:tc>
-        <w:tc>
-          <w:tcPr>
-            <w:tcW w:type="dxa" w:w="2351"/>
-          </w:tcPr>
-          <w:p>
-            <w:r>
-              <w:rPr>
-                <w:sz w:val="18"/>
-              </w:rPr>
-              <w:t>`[面談年][面談月][面談日]`</w:t>
-            </w:r>
-          </w:p>
-        </w:tc>
-        <w:tc>
-          <w:tcPr>
-            <w:tcW w:type="dxa" w:w="2351"/>
-          </w:tcPr>
-          <w:p>
-            <w:r>
-              <w:rPr>
-                <w:sz w:val="18"/>
+                <w:sz w:val="17"/>
               </w:rPr>
               <w:t>面談実施日</w:t>
             </w:r>
@@ -1714,14 +149,14 @@
         </w:tc>
         <w:tc>
           <w:tcPr>
-            <w:tcW w:type="dxa" w:w="2351"/>
+            <w:tcW w:type="dxa" w:w="4703"/>
           </w:tcPr>
           <w:p>
             <w:r>
               <w:rPr>
-                <w:sz w:val="18"/>
+                <w:sz w:val="17"/>
               </w:rPr>
-              <w:t>令和7年7月6日</w:t>
+              <w:t>令和 **[面談年]** 年 **[面談月]** 月 **[面談日]** 日</w:t>
             </w:r>
           </w:p>
         </w:tc>
@@ -1729,52 +164,27 @@
       <w:tr>
         <w:tc>
           <w:tcPr>
-            <w:tcW w:type="dxa" w:w="2351"/>
+            <w:tcW w:type="dxa" w:w="4703"/>
           </w:tcPr>
           <w:p>
             <w:r>
               <w:rPr>
-                <w:sz w:val="18"/>
+                <w:sz w:val="17"/>
               </w:rPr>
+              <w:t>時間</w:t>
             </w:r>
           </w:p>
         </w:tc>
         <w:tc>
           <w:tcPr>
-            <w:tcW w:type="dxa" w:w="2351"/>
+            <w:tcW w:type="dxa" w:w="4703"/>
           </w:tcPr>
           <w:p>
             <w:r>
               <w:rPr>
-                <w:sz w:val="18"/>
+                <w:sz w:val="17"/>
               </w:rPr>
-              <w:t>`[開始時刻][終了時刻]`</w:t>
-            </w:r>
-          </w:p>
-        </w:tc>
-        <w:tc>
-          <w:tcPr>
-            <w:tcW w:type="dxa" w:w="2351"/>
-          </w:tcPr>
-          <w:p>
-            <w:r>
-              <w:rPr>
-                <w:sz w:val="18"/>
-              </w:rPr>
-              <w:t>面談時間帯</w:t>
-            </w:r>
-          </w:p>
-        </w:tc>
-        <w:tc>
-          <w:tcPr>
-            <w:tcW w:type="dxa" w:w="2351"/>
-          </w:tcPr>
-          <w:p>
-            <w:r>
-              <w:rPr>
-                <w:sz w:val="18"/>
-              </w:rPr>
-              <w:t>14:00〜14:40</w:t>
+              <w:t>**[開始時刻]** 〜 **[終了時刻]**（約 **[所要時間]** 分）</w:t>
             </w:r>
           </w:p>
         </w:tc>
@@ -1782,52 +192,27 @@
       <w:tr>
         <w:tc>
           <w:tcPr>
-            <w:tcW w:type="dxa" w:w="2351"/>
+            <w:tcW w:type="dxa" w:w="4703"/>
           </w:tcPr>
           <w:p>
             <w:r>
               <w:rPr>
-                <w:sz w:val="18"/>
+                <w:sz w:val="17"/>
               </w:rPr>
+              <w:t>実施場所</w:t>
             </w:r>
           </w:p>
         </w:tc>
         <w:tc>
           <w:tcPr>
-            <w:tcW w:type="dxa" w:w="2351"/>
+            <w:tcW w:type="dxa" w:w="4703"/>
           </w:tcPr>
           <w:p>
             <w:r>
               <w:rPr>
-                <w:sz w:val="18"/>
+                <w:sz w:val="17"/>
               </w:rPr>
-              <w:t>`[面談実施場所]`</w:t>
-            </w:r>
-          </w:p>
-        </w:tc>
-        <w:tc>
-          <w:tcPr>
-            <w:tcW w:type="dxa" w:w="2351"/>
-          </w:tcPr>
-          <w:p>
-            <w:r>
-              <w:rPr>
-                <w:sz w:val="18"/>
-              </w:rPr>
-              <w:t>面談を行った場所</w:t>
-            </w:r>
-          </w:p>
-        </w:tc>
-        <w:tc>
-          <w:tcPr>
-            <w:tcW w:type="dxa" w:w="2351"/>
-          </w:tcPr>
-          <w:p>
-            <w:r>
-              <w:rPr>
-                <w:sz w:val="18"/>
-              </w:rPr>
-              <w:t>受入機関事業所内</w:t>
+              <w:t>**[面談実施場所]**</w:t>
             </w:r>
           </w:p>
         </w:tc>
@@ -1835,52 +220,27 @@
       <w:tr>
         <w:tc>
           <w:tcPr>
-            <w:tcW w:type="dxa" w:w="2351"/>
+            <w:tcW w:type="dxa" w:w="4703"/>
           </w:tcPr>
           <w:p>
             <w:r>
               <w:rPr>
-                <w:sz w:val="18"/>
+                <w:sz w:val="17"/>
               </w:rPr>
+              <w:t>方法</w:t>
             </w:r>
           </w:p>
         </w:tc>
         <w:tc>
           <w:tcPr>
-            <w:tcW w:type="dxa" w:w="2351"/>
+            <w:tcW w:type="dxa" w:w="4703"/>
           </w:tcPr>
           <w:p>
             <w:r>
               <w:rPr>
-                <w:sz w:val="18"/>
+                <w:sz w:val="17"/>
               </w:rPr>
-              <w:t>`[面談通算回数]`</w:t>
-            </w:r>
-          </w:p>
-        </w:tc>
-        <w:tc>
-          <w:tcPr>
-            <w:tcW w:type="dxa" w:w="2351"/>
-          </w:tcPr>
-          <w:p>
-            <w:r>
-              <w:rPr>
-                <w:sz w:val="18"/>
-              </w:rPr>
-              <w:t>通算の面談回数</w:t>
-            </w:r>
-          </w:p>
-        </w:tc>
-        <w:tc>
-          <w:tcPr>
-            <w:tcW w:type="dxa" w:w="2351"/>
-          </w:tcPr>
-          <w:p>
-            <w:r>
-              <w:rPr>
-                <w:sz w:val="18"/>
-              </w:rPr>
-              <w:t>第3回目</w:t>
+              <w:t>□対面　□オンライン（**[使用ツール]**）　□電話</w:t>
             </w:r>
           </w:p>
         </w:tc>
@@ -1888,53 +248,89 @@
       <w:tr>
         <w:tc>
           <w:tcPr>
-            <w:tcW w:type="dxa" w:w="2351"/>
+            <w:tcW w:type="dxa" w:w="4703"/>
           </w:tcPr>
           <w:p>
             <w:r>
               <w:rPr>
-                <w:sz w:val="18"/>
+                <w:sz w:val="17"/>
               </w:rPr>
-              <w:t>**★受入機関ごと**</w:t>
+              <w:t>面談通算回数</w:t>
             </w:r>
           </w:p>
         </w:tc>
         <w:tc>
           <w:tcPr>
-            <w:tcW w:type="dxa" w:w="2351"/>
+            <w:tcW w:type="dxa" w:w="4703"/>
           </w:tcPr>
           <w:p>
             <w:r>
               <w:rPr>
-                <w:sz w:val="18"/>
+                <w:sz w:val="17"/>
               </w:rPr>
-              <w:t>`[受入機関名]`</w:t>
+              <w:t>第 **[通算回数]** 回目</w:t>
+            </w:r>
+          </w:p>
+        </w:tc>
+      </w:tr>
+    </w:tbl>
+    <w:p/>
+    <w:p/>
+    <w:p>
+      <w:r>
+        <w:rPr>
+          <w:sz w:val="16"/>
+        </w:rPr>
+        <w:t>──────────────────────────────────────────────────</w:t>
+      </w:r>
+    </w:p>
+    <w:p/>
+    <w:p>
+      <w:r>
+        <w:rPr>
+          <w:b/>
+          <w:sz w:val="24"/>
+        </w:rPr>
+        <w:t>▌面談担当者（固定）</w:t>
+      </w:r>
+    </w:p>
+    <w:p/>
+    <w:tbl>
+      <w:tblPr>
+        <w:tblStyle w:val="TableGrid"/>
+        <w:tblW w:type="auto" w:w="0"/>
+        <w:tblLook w:firstColumn="1" w:firstRow="1" w:lastColumn="0" w:lastRow="0" w:noHBand="0" w:noVBand="1" w:val="04A0"/>
+      </w:tblPr>
+      <w:tblGrid>
+        <w:gridCol w:w="4703"/>
+        <w:gridCol w:w="4703"/>
+      </w:tblGrid>
+      <w:tr>
+        <w:tc>
+          <w:tcPr>
+            <w:tcW w:type="dxa" w:w="4703"/>
+          </w:tcPr>
+          <w:p>
+            <w:r>
+              <w:rPr>
+                <w:b/>
+                <w:sz w:val="17"/>
+              </w:rPr>
+              <w:t>項目</w:t>
             </w:r>
           </w:p>
         </w:tc>
         <w:tc>
           <w:tcPr>
-            <w:tcW w:type="dxa" w:w="2351"/>
+            <w:tcW w:type="dxa" w:w="4703"/>
           </w:tcPr>
           <w:p>
             <w:r>
               <w:rPr>
-                <w:sz w:val="18"/>
+                <w:b/>
+                <w:sz w:val="17"/>
               </w:rPr>
-              <w:t>受入機関正式名称</w:t>
-            </w:r>
-          </w:p>
-        </w:tc>
-        <w:tc>
-          <w:tcPr>
-            <w:tcW w:type="dxa" w:w="2351"/>
-          </w:tcPr>
-          <w:p>
-            <w:r>
-              <w:rPr>
-                <w:sz w:val="18"/>
-              </w:rPr>
-              <w:t>株式会社〇〇食品</w:t>
+              <w:t>内容</w:t>
             </w:r>
           </w:p>
         </w:tc>
@@ -1942,52 +338,27 @@
       <w:tr>
         <w:tc>
           <w:tcPr>
-            <w:tcW w:type="dxa" w:w="2351"/>
+            <w:tcW w:type="dxa" w:w="4703"/>
           </w:tcPr>
           <w:p>
             <w:r>
               <w:rPr>
-                <w:sz w:val="18"/>
+                <w:sz w:val="17"/>
               </w:rPr>
+              <w:t>登録支援機関名称</w:t>
             </w:r>
           </w:p>
         </w:tc>
         <w:tc>
           <w:tcPr>
-            <w:tcW w:type="dxa" w:w="2351"/>
+            <w:tcW w:type="dxa" w:w="4703"/>
           </w:tcPr>
           <w:p>
             <w:r>
               <w:rPr>
-                <w:sz w:val="18"/>
+                <w:sz w:val="17"/>
               </w:rPr>
-              <w:t>`[監督者氏名][監督者役職]`</w:t>
-            </w:r>
-          </w:p>
-        </w:tc>
-        <w:tc>
-          <w:tcPr>
-            <w:tcW w:type="dxa" w:w="2351"/>
-          </w:tcPr>
-          <w:p>
-            <w:r>
-              <w:rPr>
-                <w:sz w:val="18"/>
-              </w:rPr>
-              <w:t>監督者情報</w:t>
-            </w:r>
-          </w:p>
-        </w:tc>
-        <w:tc>
-          <w:tcPr>
-            <w:tcW w:type="dxa" w:w="2351"/>
-          </w:tcPr>
-          <w:p>
-            <w:r>
-              <w:rPr>
-                <w:sz w:val="18"/>
-              </w:rPr>
-              <w:t>山田太郎・製造課長</w:t>
+              <w:t>[自社名称]　／　19登－XXXXXXXX</w:t>
             </w:r>
           </w:p>
         </w:tc>
@@ -1995,52 +366,89 @@
       <w:tr>
         <w:tc>
           <w:tcPr>
-            <w:tcW w:type="dxa" w:w="2351"/>
+            <w:tcW w:type="dxa" w:w="4703"/>
           </w:tcPr>
           <w:p>
             <w:r>
               <w:rPr>
-                <w:sz w:val="18"/>
+                <w:sz w:val="17"/>
               </w:rPr>
+              <w:t>面談担当者氏名</w:t>
             </w:r>
           </w:p>
         </w:tc>
         <w:tc>
           <w:tcPr>
-            <w:tcW w:type="dxa" w:w="2351"/>
+            <w:tcW w:type="dxa" w:w="4703"/>
           </w:tcPr>
           <w:p>
             <w:r>
               <w:rPr>
-                <w:sz w:val="18"/>
+                <w:sz w:val="17"/>
               </w:rPr>
-              <w:t>`[外国人氏名_N]`</w:t>
+              <w:t>[面談担当者氏名]　／　[面談担当者役職]</w:t>
+            </w:r>
+          </w:p>
+        </w:tc>
+      </w:tr>
+    </w:tbl>
+    <w:p/>
+    <w:p/>
+    <w:p>
+      <w:r>
+        <w:rPr>
+          <w:sz w:val="16"/>
+        </w:rPr>
+        <w:t>──────────────────────────────────────────────────</w:t>
+      </w:r>
+    </w:p>
+    <w:p/>
+    <w:p>
+      <w:r>
+        <w:rPr>
+          <w:b/>
+          <w:sz w:val="24"/>
+        </w:rPr>
+        <w:t>▌面談対象・監督者情報</w:t>
+      </w:r>
+    </w:p>
+    <w:p/>
+    <w:tbl>
+      <w:tblPr>
+        <w:tblStyle w:val="TableGrid"/>
+        <w:tblW w:type="auto" w:w="0"/>
+        <w:tblLook w:firstColumn="1" w:firstRow="1" w:lastColumn="0" w:lastRow="0" w:noHBand="0" w:noVBand="1" w:val="04A0"/>
+      </w:tblPr>
+      <w:tblGrid>
+        <w:gridCol w:w="4703"/>
+        <w:gridCol w:w="4703"/>
+      </w:tblGrid>
+      <w:tr>
+        <w:tc>
+          <w:tcPr>
+            <w:tcW w:type="dxa" w:w="4703"/>
+          </w:tcPr>
+          <w:p>
+            <w:r>
+              <w:rPr>
+                <w:b/>
+                <w:sz w:val="17"/>
+              </w:rPr>
+              <w:t>項目</w:t>
             </w:r>
           </w:p>
         </w:tc>
         <w:tc>
           <w:tcPr>
-            <w:tcW w:type="dxa" w:w="2351"/>
+            <w:tcW w:type="dxa" w:w="4703"/>
           </w:tcPr>
           <w:p>
             <w:r>
               <w:rPr>
-                <w:sz w:val="18"/>
+                <w:b/>
+                <w:sz w:val="17"/>
               </w:rPr>
-              <w:t>対象外国人氏名</w:t>
-            </w:r>
-          </w:p>
-        </w:tc>
-        <w:tc>
-          <w:tcPr>
-            <w:tcW w:type="dxa" w:w="2351"/>
-          </w:tcPr>
-          <w:p>
-            <w:r>
-              <w:rPr>
-                <w:sz w:val="18"/>
-              </w:rPr>
-              <w:t>NGUYEN VAN A</w:t>
+              <w:t>内容</w:t>
             </w:r>
           </w:p>
         </w:tc>
@@ -2048,53 +456,27 @@
       <w:tr>
         <w:tc>
           <w:tcPr>
-            <w:tcW w:type="dxa" w:w="2351"/>
+            <w:tcW w:type="dxa" w:w="4703"/>
           </w:tcPr>
           <w:p>
             <w:r>
               <w:rPr>
-                <w:sz w:val="18"/>
+                <w:sz w:val="17"/>
               </w:rPr>
-              <w:t>**★確認結果**</w:t>
+              <w:t>受入機関名称</w:t>
             </w:r>
           </w:p>
         </w:tc>
         <w:tc>
           <w:tcPr>
-            <w:tcW w:type="dxa" w:w="2351"/>
+            <w:tcW w:type="dxa" w:w="4703"/>
           </w:tcPr>
           <w:p>
             <w:r>
               <w:rPr>
-                <w:sz w:val="18"/>
+                <w:sz w:val="17"/>
               </w:rPr>
-              <w:t>`[業務習熟度・適応状況]`</w:t>
-            </w:r>
-          </w:p>
-        </w:tc>
-        <w:tc>
-          <w:tcPr>
-            <w:tcW w:type="dxa" w:w="2351"/>
-          </w:tcPr>
-          <w:p>
-            <w:r>
-              <w:rPr>
-                <w:sz w:val="18"/>
-              </w:rPr>
-              <w:t>業務習熟の状況</w:t>
-            </w:r>
-          </w:p>
-        </w:tc>
-        <w:tc>
-          <w:tcPr>
-            <w:tcW w:type="dxa" w:w="2351"/>
-          </w:tcPr>
-          <w:p>
-            <w:r>
-              <w:rPr>
-                <w:sz w:val="18"/>
-              </w:rPr>
-              <w:t>良好</w:t>
+              <w:t>**[受入機関名]**</w:t>
             </w:r>
           </w:p>
         </w:tc>
@@ -2102,52 +484,27 @@
       <w:tr>
         <w:tc>
           <w:tcPr>
-            <w:tcW w:type="dxa" w:w="2351"/>
+            <w:tcW w:type="dxa" w:w="4703"/>
           </w:tcPr>
           <w:p>
             <w:r>
               <w:rPr>
-                <w:sz w:val="18"/>
+                <w:sz w:val="17"/>
               </w:rPr>
+              <w:t>受入機関所在地</w:t>
             </w:r>
           </w:p>
         </w:tc>
         <w:tc>
           <w:tcPr>
-            <w:tcW w:type="dxa" w:w="2351"/>
+            <w:tcW w:type="dxa" w:w="4703"/>
           </w:tcPr>
           <w:p>
             <w:r>
               <w:rPr>
-                <w:sz w:val="18"/>
+                <w:sz w:val="17"/>
               </w:rPr>
-              <w:t>`[苦情相談内容]`</w:t>
-            </w:r>
-          </w:p>
-        </w:tc>
-        <w:tc>
-          <w:tcPr>
-            <w:tcW w:type="dxa" w:w="2351"/>
-          </w:tcPr>
-          <w:p>
-            <w:r>
-              <w:rPr>
-                <w:sz w:val="18"/>
-              </w:rPr>
-              <w:t>機関で把握した相談</w:t>
-            </w:r>
-          </w:p>
-        </w:tc>
-        <w:tc>
-          <w:tcPr>
-            <w:tcW w:type="dxa" w:w="2351"/>
-          </w:tcPr>
-          <w:p>
-            <w:r>
-              <w:rPr>
-                <w:sz w:val="18"/>
-              </w:rPr>
-              <w:t>特になし</w:t>
+              <w:t>**[受入機関所在地]**</w:t>
             </w:r>
           </w:p>
         </w:tc>
@@ -2155,52 +512,27 @@
       <w:tr>
         <w:tc>
           <w:tcPr>
-            <w:tcW w:type="dxa" w:w="2351"/>
+            <w:tcW w:type="dxa" w:w="4703"/>
           </w:tcPr>
           <w:p>
             <w:r>
               <w:rPr>
-                <w:sz w:val="18"/>
+                <w:sz w:val="17"/>
               </w:rPr>
+              <w:t>監督者氏名</w:t>
             </w:r>
           </w:p>
         </w:tc>
         <w:tc>
           <w:tcPr>
-            <w:tcW w:type="dxa" w:w="2351"/>
+            <w:tcW w:type="dxa" w:w="4703"/>
           </w:tcPr>
           <w:p>
             <w:r>
               <w:rPr>
-                <w:sz w:val="18"/>
+                <w:sz w:val="17"/>
               </w:rPr>
-              <w:t>`[受入機関特記事項要望]`</w:t>
-            </w:r>
-          </w:p>
-        </w:tc>
-        <w:tc>
-          <w:tcPr>
-            <w:tcW w:type="dxa" w:w="2351"/>
-          </w:tcPr>
-          <w:p>
-            <w:r>
-              <w:rPr>
-                <w:sz w:val="18"/>
-              </w:rPr>
-              <w:t>機関側の要望等</w:t>
-            </w:r>
-          </w:p>
-        </w:tc>
-        <w:tc>
-          <w:tcPr>
-            <w:tcW w:type="dxa" w:w="2351"/>
-          </w:tcPr>
-          <w:p>
-            <w:r>
-              <w:rPr>
-                <w:sz w:val="18"/>
-              </w:rPr>
-              <w:t>特になし</w:t>
+              <w:t>**[監督者氏名]**</w:t>
             </w:r>
           </w:p>
         </w:tc>
@@ -2208,52 +540,27 @@
       <w:tr>
         <w:tc>
           <w:tcPr>
-            <w:tcW w:type="dxa" w:w="2351"/>
+            <w:tcW w:type="dxa" w:w="4703"/>
           </w:tcPr>
           <w:p>
             <w:r>
               <w:rPr>
-                <w:sz w:val="18"/>
+                <w:sz w:val="17"/>
               </w:rPr>
+              <w:t>監督者役職</w:t>
             </w:r>
           </w:p>
         </w:tc>
         <w:tc>
           <w:tcPr>
-            <w:tcW w:type="dxa" w:w="2351"/>
+            <w:tcW w:type="dxa" w:w="4703"/>
           </w:tcPr>
           <w:p>
             <w:r>
               <w:rPr>
-                <w:sz w:val="18"/>
+                <w:sz w:val="17"/>
               </w:rPr>
-              <w:t>`[面談担当者所見]`</w:t>
-            </w:r>
-          </w:p>
-        </w:tc>
-        <w:tc>
-          <w:tcPr>
-            <w:tcW w:type="dxa" w:w="2351"/>
-          </w:tcPr>
-          <w:p>
-            <w:r>
-              <w:rPr>
-                <w:sz w:val="18"/>
-              </w:rPr>
-              <w:t>担当者の総合所見</w:t>
-            </w:r>
-          </w:p>
-        </w:tc>
-        <w:tc>
-          <w:tcPr>
-            <w:tcW w:type="dxa" w:w="2351"/>
-          </w:tcPr>
-          <w:p>
-            <w:r>
-              <w:rPr>
-                <w:sz w:val="18"/>
-              </w:rPr>
-              <w:t>3〜5行程度</w:t>
+              <w:t>**[監督者役職]**</w:t>
             </w:r>
           </w:p>
         </w:tc>
@@ -2261,76 +568,2185 @@
       <w:tr>
         <w:tc>
           <w:tcPr>
-            <w:tcW w:type="dxa" w:w="2351"/>
+            <w:tcW w:type="dxa" w:w="4703"/>
           </w:tcPr>
           <w:p>
             <w:r>
               <w:rPr>
-                <w:sz w:val="18"/>
+                <w:sz w:val="17"/>
               </w:rPr>
-              <w:t>**██固定██**</w:t>
+              <w:t>監督者連絡先</w:t>
             </w:r>
           </w:p>
         </w:tc>
         <w:tc>
           <w:tcPr>
-            <w:tcW w:type="dxa" w:w="2351"/>
+            <w:tcW w:type="dxa" w:w="4703"/>
           </w:tcPr>
           <w:p>
             <w:r>
               <w:rPr>
-                <w:sz w:val="18"/>
+                <w:sz w:val="17"/>
               </w:rPr>
-              <w:t>`[自社名称]` `[面談担当者氏名]`</w:t>
-            </w:r>
-          </w:p>
-        </w:tc>
-        <w:tc>
-          <w:tcPr>
-            <w:tcW w:type="dxa" w:w="2351"/>
-          </w:tcPr>
-          <w:p>
-            <w:r>
-              <w:rPr>
-                <w:sz w:val="18"/>
-              </w:rPr>
-              <w:t>会社マスタより</w:t>
-            </w:r>
-          </w:p>
-        </w:tc>
-        <w:tc>
-          <w:tcPr>
-            <w:tcW w:type="dxa" w:w="2351"/>
-          </w:tcPr>
-          <w:p>
-            <w:r>
-              <w:rPr>
-                <w:sz w:val="18"/>
-              </w:rPr>
-              <w:t>永久固定</w:t>
+              <w:t>**[監督者TEL]**</w:t>
             </w:r>
           </w:p>
         </w:tc>
       </w:tr>
     </w:tbl>
     <w:p/>
+    <w:p/>
     <w:p>
       <w:r>
-        <w:t>────────────────────────────────────────</w:t>
+        <w:rPr>
+          <w:sz w:val="19"/>
+        </w:rPr>
+        <w:t>**当該面談の対象外国人**</w:t>
+      </w:r>
+    </w:p>
+    <w:p/>
+    <w:tbl>
+      <w:tblPr>
+        <w:tblStyle w:val="TableGrid"/>
+        <w:tblW w:type="auto" w:w="0"/>
+        <w:tblLook w:firstColumn="1" w:firstRow="1" w:lastColumn="0" w:lastRow="0" w:noHBand="0" w:noVBand="1" w:val="04A0"/>
+      </w:tblPr>
+      <w:tblGrid>
+        <w:gridCol w:w="1881"/>
+        <w:gridCol w:w="1881"/>
+        <w:gridCol w:w="1881"/>
+        <w:gridCol w:w="1881"/>
+        <w:gridCol w:w="1881"/>
+      </w:tblGrid>
+      <w:tr>
+        <w:tc>
+          <w:tcPr>
+            <w:tcW w:type="dxa" w:w="1881"/>
+          </w:tcPr>
+          <w:p>
+            <w:r>
+              <w:rPr>
+                <w:b/>
+                <w:sz w:val="17"/>
+              </w:rPr>
+              <w:t>No</w:t>
+            </w:r>
+          </w:p>
+        </w:tc>
+        <w:tc>
+          <w:tcPr>
+            <w:tcW w:type="dxa" w:w="1881"/>
+          </w:tcPr>
+          <w:p>
+            <w:r>
+              <w:rPr>
+                <w:b/>
+                <w:sz w:val="17"/>
+              </w:rPr>
+              <w:t>氏名（ローマ字）</w:t>
+            </w:r>
+          </w:p>
+        </w:tc>
+        <w:tc>
+          <w:tcPr>
+            <w:tcW w:type="dxa" w:w="1881"/>
+          </w:tcPr>
+          <w:p>
+            <w:r>
+              <w:rPr>
+                <w:b/>
+                <w:sz w:val="17"/>
+              </w:rPr>
+              <w:t>国籍</w:t>
+            </w:r>
+          </w:p>
+        </w:tc>
+        <w:tc>
+          <w:tcPr>
+            <w:tcW w:type="dxa" w:w="1881"/>
+          </w:tcPr>
+          <w:p>
+            <w:r>
+              <w:rPr>
+                <w:b/>
+                <w:sz w:val="17"/>
+              </w:rPr>
+              <w:t>在留カード番号</w:t>
+            </w:r>
+          </w:p>
+        </w:tc>
+        <w:tc>
+          <w:tcPr>
+            <w:tcW w:type="dxa" w:w="1881"/>
+          </w:tcPr>
+          <w:p>
+            <w:r>
+              <w:rPr>
+                <w:b/>
+                <w:sz w:val="17"/>
+              </w:rPr>
+              <w:t>就労開始日</w:t>
+            </w:r>
+          </w:p>
+        </w:tc>
+      </w:tr>
+      <w:tr>
+        <w:tc>
+          <w:tcPr>
+            <w:tcW w:type="dxa" w:w="1881"/>
+          </w:tcPr>
+          <w:p>
+            <w:r>
+              <w:rPr>
+                <w:sz w:val="17"/>
+              </w:rPr>
+              <w:t>1</w:t>
+            </w:r>
+          </w:p>
+        </w:tc>
+        <w:tc>
+          <w:tcPr>
+            <w:tcW w:type="dxa" w:w="1881"/>
+          </w:tcPr>
+          <w:p>
+            <w:r>
+              <w:rPr>
+                <w:sz w:val="17"/>
+              </w:rPr>
+              <w:t>**[外国人氏名_1]**</w:t>
+            </w:r>
+          </w:p>
+        </w:tc>
+        <w:tc>
+          <w:tcPr>
+            <w:tcW w:type="dxa" w:w="1881"/>
+          </w:tcPr>
+          <w:p>
+            <w:r>
+              <w:rPr>
+                <w:sz w:val="17"/>
+              </w:rPr>
+              <w:t>**[国籍_1]**</w:t>
+            </w:r>
+          </w:p>
+        </w:tc>
+        <w:tc>
+          <w:tcPr>
+            <w:tcW w:type="dxa" w:w="1881"/>
+          </w:tcPr>
+          <w:p>
+            <w:r>
+              <w:rPr>
+                <w:sz w:val="17"/>
+              </w:rPr>
+              <w:t>**[番号_1]**</w:t>
+            </w:r>
+          </w:p>
+        </w:tc>
+        <w:tc>
+          <w:tcPr>
+            <w:tcW w:type="dxa" w:w="1881"/>
+          </w:tcPr>
+          <w:p>
+            <w:r>
+              <w:rPr>
+                <w:sz w:val="17"/>
+              </w:rPr>
+              <w:t>令和 **[就労開始日_1]**</w:t>
+            </w:r>
+          </w:p>
+        </w:tc>
+      </w:tr>
+      <w:tr>
+        <w:tc>
+          <w:tcPr>
+            <w:tcW w:type="dxa" w:w="1881"/>
+          </w:tcPr>
+          <w:p>
+            <w:r>
+              <w:rPr>
+                <w:sz w:val="17"/>
+              </w:rPr>
+              <w:t>2</w:t>
+            </w:r>
+          </w:p>
+        </w:tc>
+        <w:tc>
+          <w:tcPr>
+            <w:tcW w:type="dxa" w:w="1881"/>
+          </w:tcPr>
+          <w:p>
+            <w:r>
+              <w:rPr>
+                <w:sz w:val="17"/>
+              </w:rPr>
+              <w:t>**[外国人氏名_2]**</w:t>
+            </w:r>
+          </w:p>
+        </w:tc>
+        <w:tc>
+          <w:tcPr>
+            <w:tcW w:type="dxa" w:w="1881"/>
+          </w:tcPr>
+          <w:p>
+            <w:r>
+              <w:rPr>
+                <w:sz w:val="17"/>
+              </w:rPr>
+              <w:t>**[国籍_2]**</w:t>
+            </w:r>
+          </w:p>
+        </w:tc>
+        <w:tc>
+          <w:tcPr>
+            <w:tcW w:type="dxa" w:w="1881"/>
+          </w:tcPr>
+          <w:p>
+            <w:r>
+              <w:rPr>
+                <w:sz w:val="17"/>
+              </w:rPr>
+              <w:t>**[番号_2]**</w:t>
+            </w:r>
+          </w:p>
+        </w:tc>
+        <w:tc>
+          <w:tcPr>
+            <w:tcW w:type="dxa" w:w="1881"/>
+          </w:tcPr>
+          <w:p>
+            <w:r>
+              <w:rPr>
+                <w:sz w:val="17"/>
+              </w:rPr>
+              <w:t>令和 **[就労開始日_2]**</w:t>
+            </w:r>
+          </w:p>
+        </w:tc>
+      </w:tr>
+    </w:tbl>
+    <w:p/>
+    <w:p/>
+    <w:p>
+      <w:r>
+        <w:rPr>
+          <w:sz w:val="16"/>
+        </w:rPr>
+        <w:t>──────────────────────────────────────────────────</w:t>
       </w:r>
     </w:p>
     <w:p/>
     <w:p>
-      <w:pPr/>
       <w:r>
         <w:rPr>
-          <w:i/>
-          <w:color w:val="555555"/>
-          <w:sz w:val="18"/>
+          <w:b/>
+          <w:sz w:val="24"/>
         </w:rPr>
-        <w:t>**運用ヒント：** 本書（第４－４号）と外国人用（第４－３号）は**必ず同日または近接日に実施**し、セットで保管・四半期報告に添付すること。監督者面談と外国人面談で内容に齟齬が生じた場合は「問題事案あり」として第５部②に記録する。</w:t>
+        <w:t>▌確認項目①：外国人の就労状況</w:t>
       </w:r>
     </w:p>
+    <w:p/>
+    <w:tbl>
+      <w:tblPr>
+        <w:tblStyle w:val="TableGrid"/>
+        <w:tblW w:type="auto" w:w="0"/>
+        <w:tblLook w:firstColumn="1" w:firstRow="1" w:lastColumn="0" w:lastRow="0" w:noHBand="0" w:noVBand="1" w:val="04A0"/>
+      </w:tblPr>
+      <w:tblGrid>
+        <w:gridCol w:w="3135"/>
+        <w:gridCol w:w="3135"/>
+        <w:gridCol w:w="3135"/>
+      </w:tblGrid>
+      <w:tr>
+        <w:tc>
+          <w:tcPr>
+            <w:tcW w:type="dxa" w:w="3135"/>
+          </w:tcPr>
+          <w:p>
+            <w:r>
+              <w:rPr>
+                <w:b/>
+                <w:sz w:val="17"/>
+              </w:rPr>
+              <w:t>確認項目</w:t>
+            </w:r>
+          </w:p>
+        </w:tc>
+        <w:tc>
+          <w:tcPr>
+            <w:tcW w:type="dxa" w:w="3135"/>
+          </w:tcPr>
+          <w:p>
+            <w:r>
+              <w:rPr>
+                <w:b/>
+                <w:sz w:val="17"/>
+              </w:rPr>
+              <w:t>結果</w:t>
+            </w:r>
+          </w:p>
+        </w:tc>
+        <w:tc>
+          <w:tcPr>
+            <w:tcW w:type="dxa" w:w="3135"/>
+          </w:tcPr>
+          <w:p>
+            <w:r>
+              <w:rPr>
+                <w:b/>
+                <w:sz w:val="17"/>
+              </w:rPr>
+              <w:t>問題内容（問題ありの場合）</w:t>
+            </w:r>
+          </w:p>
+        </w:tc>
+      </w:tr>
+      <w:tr>
+        <w:tc>
+          <w:tcPr>
+            <w:tcW w:type="dxa" w:w="3135"/>
+          </w:tcPr>
+          <w:p>
+            <w:r>
+              <w:rPr>
+                <w:sz w:val="17"/>
+              </w:rPr>
+              <w:t>雇用契約書の業務内容と実際が一致しているか</w:t>
+            </w:r>
+          </w:p>
+        </w:tc>
+        <w:tc>
+          <w:tcPr>
+            <w:tcW w:type="dxa" w:w="3135"/>
+          </w:tcPr>
+          <w:p>
+            <w:r>
+              <w:rPr>
+                <w:sz w:val="17"/>
+              </w:rPr>
+              <w:t>□一致　□相違あり</w:t>
+            </w:r>
+          </w:p>
+        </w:tc>
+        <w:tc>
+          <w:tcPr>
+            <w:tcW w:type="dxa" w:w="3135"/>
+          </w:tcPr>
+          <w:p>
+            <w:r>
+              <w:rPr>
+                <w:sz w:val="17"/>
+              </w:rPr>
+              <w:t>**[相違内容]**</w:t>
+            </w:r>
+          </w:p>
+        </w:tc>
+      </w:tr>
+      <w:tr>
+        <w:tc>
+          <w:tcPr>
+            <w:tcW w:type="dxa" w:w="3135"/>
+          </w:tcPr>
+          <w:p>
+            <w:r>
+              <w:rPr>
+                <w:sz w:val="17"/>
+              </w:rPr>
+              <w:t>業務習熟度・職場への適応状況</w:t>
+            </w:r>
+          </w:p>
+        </w:tc>
+        <w:tc>
+          <w:tcPr>
+            <w:tcW w:type="dxa" w:w="3135"/>
+          </w:tcPr>
+          <w:p>
+            <w:r>
+              <w:rPr>
+                <w:sz w:val="17"/>
+              </w:rPr>
+              <w:t>□良好　□普通　□課題あり</w:t>
+            </w:r>
+          </w:p>
+        </w:tc>
+        <w:tc>
+          <w:tcPr>
+            <w:tcW w:type="dxa" w:w="3135"/>
+          </w:tcPr>
+          <w:p>
+            <w:r>
+              <w:rPr>
+                <w:sz w:val="17"/>
+              </w:rPr>
+              <w:t>**[内容]**</w:t>
+            </w:r>
+          </w:p>
+        </w:tc>
+      </w:tr>
+      <w:tr>
+        <w:tc>
+          <w:tcPr>
+            <w:tcW w:type="dxa" w:w="3135"/>
+          </w:tcPr>
+          <w:p>
+            <w:r>
+              <w:rPr>
+                <w:sz w:val="17"/>
+              </w:rPr>
+              <w:t>所定労働時間は守られているか</w:t>
+            </w:r>
+          </w:p>
+        </w:tc>
+        <w:tc>
+          <w:tcPr>
+            <w:tcW w:type="dxa" w:w="3135"/>
+          </w:tcPr>
+          <w:p>
+            <w:r>
+              <w:rPr>
+                <w:sz w:val="17"/>
+              </w:rPr>
+              <w:t>□遵守　□超過あり</w:t>
+            </w:r>
+          </w:p>
+        </w:tc>
+        <w:tc>
+          <w:tcPr>
+            <w:tcW w:type="dxa" w:w="3135"/>
+          </w:tcPr>
+          <w:p>
+            <w:r>
+              <w:rPr>
+                <w:sz w:val="17"/>
+              </w:rPr>
+              <w:t>月平均超過：**[超過時間]** 時間</w:t>
+            </w:r>
+          </w:p>
+        </w:tc>
+      </w:tr>
+      <w:tr>
+        <w:tc>
+          <w:tcPr>
+            <w:tcW w:type="dxa" w:w="3135"/>
+          </w:tcPr>
+          <w:p>
+            <w:r>
+              <w:rPr>
+                <w:sz w:val="17"/>
+              </w:rPr>
+              <w:t>時間外労働は36協定の範囲内か</w:t>
+            </w:r>
+          </w:p>
+        </w:tc>
+        <w:tc>
+          <w:tcPr>
+            <w:tcW w:type="dxa" w:w="3135"/>
+          </w:tcPr>
+          <w:p>
+            <w:r>
+              <w:rPr>
+                <w:sz w:val="17"/>
+              </w:rPr>
+              <w:t>□範囲内　□超過あり</w:t>
+            </w:r>
+          </w:p>
+        </w:tc>
+        <w:tc>
+          <w:tcPr>
+            <w:tcW w:type="dxa" w:w="3135"/>
+          </w:tcPr>
+          <w:p>
+            <w:r>
+              <w:rPr>
+                <w:sz w:val="17"/>
+              </w:rPr>
+              <w:t>**[超過内容]**</w:t>
+            </w:r>
+          </w:p>
+        </w:tc>
+      </w:tr>
+      <w:tr>
+        <w:tc>
+          <w:tcPr>
+            <w:tcW w:type="dxa" w:w="3135"/>
+          </w:tcPr>
+          <w:p>
+            <w:r>
+              <w:rPr>
+                <w:sz w:val="17"/>
+              </w:rPr>
+              <w:t>休日・有給休暇は適切に取得させているか</w:t>
+            </w:r>
+          </w:p>
+        </w:tc>
+        <w:tc>
+          <w:tcPr>
+            <w:tcW w:type="dxa" w:w="3135"/>
+          </w:tcPr>
+          <w:p>
+            <w:r>
+              <w:rPr>
+                <w:sz w:val="17"/>
+              </w:rPr>
+              <w:t>□取得させている　□困難な状況</w:t>
+            </w:r>
+          </w:p>
+        </w:tc>
+        <w:tc>
+          <w:tcPr>
+            <w:tcW w:type="dxa" w:w="3135"/>
+          </w:tcPr>
+          <w:p>
+            <w:r>
+              <w:rPr>
+                <w:sz w:val="17"/>
+              </w:rPr>
+              <w:t>**[理由]**</w:t>
+            </w:r>
+          </w:p>
+        </w:tc>
+      </w:tr>
+      <w:tr>
+        <w:tc>
+          <w:tcPr>
+            <w:tcW w:type="dxa" w:w="3135"/>
+          </w:tcPr>
+          <w:p>
+            <w:r>
+              <w:rPr>
+                <w:sz w:val="17"/>
+              </w:rPr>
+              <w:t>賃金は毎月適切に支払っているか</w:t>
+            </w:r>
+          </w:p>
+        </w:tc>
+        <w:tc>
+          <w:tcPr>
+            <w:tcW w:type="dxa" w:w="3135"/>
+          </w:tcPr>
+          <w:p>
+            <w:r>
+              <w:rPr>
+                <w:sz w:val="17"/>
+              </w:rPr>
+              <w:t>□支払済　□遅延・未払いあり</w:t>
+            </w:r>
+          </w:p>
+        </w:tc>
+        <w:tc>
+          <w:tcPr>
+            <w:tcW w:type="dxa" w:w="3135"/>
+          </w:tcPr>
+          <w:p>
+            <w:r>
+              <w:rPr>
+                <w:sz w:val="17"/>
+              </w:rPr>
+              <w:t>**[詳細]**</w:t>
+            </w:r>
+          </w:p>
+        </w:tc>
+      </w:tr>
+      <w:tr>
+        <w:tc>
+          <w:tcPr>
+            <w:tcW w:type="dxa" w:w="3135"/>
+          </w:tcPr>
+          <w:p>
+            <w:r>
+              <w:rPr>
+                <w:sz w:val="17"/>
+              </w:rPr>
+              <w:t>給与明細を交付しているか</w:t>
+            </w:r>
+          </w:p>
+        </w:tc>
+        <w:tc>
+          <w:tcPr>
+            <w:tcW w:type="dxa" w:w="3135"/>
+          </w:tcPr>
+          <w:p>
+            <w:r>
+              <w:rPr>
+                <w:sz w:val="17"/>
+              </w:rPr>
+              <w:t>□交付あり　□なし</w:t>
+            </w:r>
+          </w:p>
+        </w:tc>
+        <w:tc>
+          <w:tcPr>
+            <w:tcW w:type="dxa" w:w="3135"/>
+          </w:tcPr>
+          <w:p>
+            <w:r>
+              <w:rPr>
+                <w:sz w:val="17"/>
+              </w:rPr>
+              <w:t>**[理由]**</w:t>
+            </w:r>
+          </w:p>
+        </w:tc>
+      </w:tr>
+      <w:tr>
+        <w:tc>
+          <w:tcPr>
+            <w:tcW w:type="dxa" w:w="3135"/>
+          </w:tcPr>
+          <w:p>
+            <w:r>
+              <w:rPr>
+                <w:sz w:val="17"/>
+              </w:rPr>
+              <w:t>不当な控除はないか</w:t>
+            </w:r>
+          </w:p>
+        </w:tc>
+        <w:tc>
+          <w:tcPr>
+            <w:tcW w:type="dxa" w:w="3135"/>
+          </w:tcPr>
+          <w:p>
+            <w:r>
+              <w:rPr>
+                <w:sz w:val="17"/>
+              </w:rPr>
+              <w:t>□なし　□あり</w:t>
+            </w:r>
+          </w:p>
+        </w:tc>
+        <w:tc>
+          <w:tcPr>
+            <w:tcW w:type="dxa" w:w="3135"/>
+          </w:tcPr>
+          <w:p>
+            <w:r>
+              <w:rPr>
+                <w:sz w:val="17"/>
+              </w:rPr>
+              <w:t>**[内容]**</w:t>
+            </w:r>
+          </w:p>
+        </w:tc>
+      </w:tr>
+      <w:tr>
+        <w:tc>
+          <w:tcPr>
+            <w:tcW w:type="dxa" w:w="3135"/>
+          </w:tcPr>
+          <w:p>
+            <w:r>
+              <w:rPr>
+                <w:sz w:val="17"/>
+              </w:rPr>
+              <w:t>最低賃金以上を支払っているか</w:t>
+            </w:r>
+          </w:p>
+        </w:tc>
+        <w:tc>
+          <w:tcPr>
+            <w:tcW w:type="dxa" w:w="3135"/>
+          </w:tcPr>
+          <w:p>
+            <w:r>
+              <w:rPr>
+                <w:sz w:val="17"/>
+              </w:rPr>
+              <w:t>□確認済　□要確認</w:t>
+            </w:r>
+          </w:p>
+        </w:tc>
+        <w:tc>
+          <w:tcPr>
+            <w:tcW w:type="dxa" w:w="3135"/>
+          </w:tcPr>
+          <w:p>
+            <w:r>
+              <w:rPr>
+                <w:sz w:val="17"/>
+              </w:rPr>
+              <w:t>—</w:t>
+            </w:r>
+          </w:p>
+        </w:tc>
+      </w:tr>
+      <w:tr>
+        <w:tc>
+          <w:tcPr>
+            <w:tcW w:type="dxa" w:w="3135"/>
+          </w:tcPr>
+          <w:p>
+            <w:r>
+              <w:rPr>
+                <w:sz w:val="17"/>
+              </w:rPr>
+              <w:t>健康保険に加入させているか</w:t>
+            </w:r>
+          </w:p>
+        </w:tc>
+        <w:tc>
+          <w:tcPr>
+            <w:tcW w:type="dxa" w:w="3135"/>
+          </w:tcPr>
+          <w:p>
+            <w:r>
+              <w:rPr>
+                <w:sz w:val="17"/>
+              </w:rPr>
+              <w:t>□加入済　□未加入</w:t>
+            </w:r>
+          </w:p>
+        </w:tc>
+        <w:tc>
+          <w:tcPr>
+            <w:tcW w:type="dxa" w:w="3135"/>
+          </w:tcPr>
+          <w:p>
+            <w:r>
+              <w:rPr>
+                <w:sz w:val="17"/>
+              </w:rPr>
+              <w:t>**[理由]**</w:t>
+            </w:r>
+          </w:p>
+        </w:tc>
+      </w:tr>
+      <w:tr>
+        <w:tc>
+          <w:tcPr>
+            <w:tcW w:type="dxa" w:w="3135"/>
+          </w:tcPr>
+          <w:p>
+            <w:r>
+              <w:rPr>
+                <w:sz w:val="17"/>
+              </w:rPr>
+              <w:t>厚生年金に加入させているか</w:t>
+            </w:r>
+          </w:p>
+        </w:tc>
+        <w:tc>
+          <w:tcPr>
+            <w:tcW w:type="dxa" w:w="3135"/>
+          </w:tcPr>
+          <w:p>
+            <w:r>
+              <w:rPr>
+                <w:sz w:val="17"/>
+              </w:rPr>
+              <w:t>□加入済　□未加入</w:t>
+            </w:r>
+          </w:p>
+        </w:tc>
+        <w:tc>
+          <w:tcPr>
+            <w:tcW w:type="dxa" w:w="3135"/>
+          </w:tcPr>
+          <w:p>
+            <w:r>
+              <w:rPr>
+                <w:sz w:val="17"/>
+              </w:rPr>
+              <w:t>**[理由]**</w:t>
+            </w:r>
+          </w:p>
+        </w:tc>
+      </w:tr>
+      <w:tr>
+        <w:tc>
+          <w:tcPr>
+            <w:tcW w:type="dxa" w:w="3135"/>
+          </w:tcPr>
+          <w:p>
+            <w:r>
+              <w:rPr>
+                <w:sz w:val="17"/>
+              </w:rPr>
+              <w:t>雇用保険に加入させているか</w:t>
+            </w:r>
+          </w:p>
+        </w:tc>
+        <w:tc>
+          <w:tcPr>
+            <w:tcW w:type="dxa" w:w="3135"/>
+          </w:tcPr>
+          <w:p>
+            <w:r>
+              <w:rPr>
+                <w:sz w:val="17"/>
+              </w:rPr>
+              <w:t>□加入済　□未加入</w:t>
+            </w:r>
+          </w:p>
+        </w:tc>
+        <w:tc>
+          <w:tcPr>
+            <w:tcW w:type="dxa" w:w="3135"/>
+          </w:tcPr>
+          <w:p>
+            <w:r>
+              <w:rPr>
+                <w:sz w:val="17"/>
+              </w:rPr>
+              <w:t>**[理由]**</w:t>
+            </w:r>
+          </w:p>
+        </w:tc>
+      </w:tr>
+      <w:tr>
+        <w:tc>
+          <w:tcPr>
+            <w:tcW w:type="dxa" w:w="3135"/>
+          </w:tcPr>
+          <w:p>
+            <w:r>
+              <w:rPr>
+                <w:sz w:val="17"/>
+              </w:rPr>
+              <w:t>労災保険に加入させているか</w:t>
+            </w:r>
+          </w:p>
+        </w:tc>
+        <w:tc>
+          <w:tcPr>
+            <w:tcW w:type="dxa" w:w="3135"/>
+          </w:tcPr>
+          <w:p>
+            <w:r>
+              <w:rPr>
+                <w:sz w:val="17"/>
+              </w:rPr>
+              <w:t>□加入済　□未加入</w:t>
+            </w:r>
+          </w:p>
+        </w:tc>
+        <w:tc>
+          <w:tcPr>
+            <w:tcW w:type="dxa" w:w="3135"/>
+          </w:tcPr>
+          <w:p>
+            <w:r>
+              <w:rPr>
+                <w:sz w:val="17"/>
+              </w:rPr>
+              <w:t>**[理由]**</w:t>
+            </w:r>
+          </w:p>
+        </w:tc>
+      </w:tr>
+    </w:tbl>
+    <w:p/>
+    <w:p/>
+    <w:p>
+      <w:r>
+        <w:rPr>
+          <w:sz w:val="16"/>
+        </w:rPr>
+        <w:t>──────────────────────────────────────────────────</w:t>
+      </w:r>
+    </w:p>
+    <w:p/>
+    <w:p>
+      <w:r>
+        <w:rPr>
+          <w:b/>
+          <w:sz w:val="24"/>
+        </w:rPr>
+        <w:t>▌確認項目②：職場環境・人権侵害等</w:t>
+      </w:r>
+    </w:p>
+    <w:p/>
+    <w:tbl>
+      <w:tblPr>
+        <w:tblStyle w:val="TableGrid"/>
+        <w:tblW w:type="auto" w:w="0"/>
+        <w:tblLook w:firstColumn="1" w:firstRow="1" w:lastColumn="0" w:lastRow="0" w:noHBand="0" w:noVBand="1" w:val="04A0"/>
+      </w:tblPr>
+      <w:tblGrid>
+        <w:gridCol w:w="3135"/>
+        <w:gridCol w:w="3135"/>
+        <w:gridCol w:w="3135"/>
+      </w:tblGrid>
+      <w:tr>
+        <w:tc>
+          <w:tcPr>
+            <w:tcW w:type="dxa" w:w="3135"/>
+          </w:tcPr>
+          <w:p>
+            <w:r>
+              <w:rPr>
+                <w:b/>
+                <w:sz w:val="17"/>
+              </w:rPr>
+              <w:t>確認項目</w:t>
+            </w:r>
+          </w:p>
+        </w:tc>
+        <w:tc>
+          <w:tcPr>
+            <w:tcW w:type="dxa" w:w="3135"/>
+          </w:tcPr>
+          <w:p>
+            <w:r>
+              <w:rPr>
+                <w:b/>
+                <w:sz w:val="17"/>
+              </w:rPr>
+              <w:t>結果</w:t>
+            </w:r>
+          </w:p>
+        </w:tc>
+        <w:tc>
+          <w:tcPr>
+            <w:tcW w:type="dxa" w:w="3135"/>
+          </w:tcPr>
+          <w:p>
+            <w:r>
+              <w:rPr>
+                <w:b/>
+                <w:sz w:val="17"/>
+              </w:rPr>
+              <w:t>問題内容（問題ありの場合）</w:t>
+            </w:r>
+          </w:p>
+        </w:tc>
+      </w:tr>
+      <w:tr>
+        <w:tc>
+          <w:tcPr>
+            <w:tcW w:type="dxa" w:w="3135"/>
+          </w:tcPr>
+          <w:p>
+            <w:r>
+              <w:rPr>
+                <w:sz w:val="17"/>
+              </w:rPr>
+              <w:t>安全衛生体制は整備されているか</w:t>
+            </w:r>
+          </w:p>
+        </w:tc>
+        <w:tc>
+          <w:tcPr>
+            <w:tcW w:type="dxa" w:w="3135"/>
+          </w:tcPr>
+          <w:p>
+            <w:r>
+              <w:rPr>
+                <w:sz w:val="17"/>
+              </w:rPr>
+              <w:t>□整備済　□要改善</w:t>
+            </w:r>
+          </w:p>
+        </w:tc>
+        <w:tc>
+          <w:tcPr>
+            <w:tcW w:type="dxa" w:w="3135"/>
+          </w:tcPr>
+          <w:p>
+            <w:r>
+              <w:rPr>
+                <w:sz w:val="17"/>
+              </w:rPr>
+              <w:t>**[内容]**</w:t>
+            </w:r>
+          </w:p>
+        </w:tc>
+      </w:tr>
+      <w:tr>
+        <w:tc>
+          <w:tcPr>
+            <w:tcW w:type="dxa" w:w="3135"/>
+          </w:tcPr>
+          <w:p>
+            <w:r>
+              <w:rPr>
+                <w:sz w:val="17"/>
+              </w:rPr>
+              <w:t>危険作業の教育・保護具の支給は適切か</w:t>
+            </w:r>
+          </w:p>
+        </w:tc>
+        <w:tc>
+          <w:tcPr>
+            <w:tcW w:type="dxa" w:w="3135"/>
+          </w:tcPr>
+          <w:p>
+            <w:r>
+              <w:rPr>
+                <w:sz w:val="17"/>
+              </w:rPr>
+              <w:t>□適切　□不足あり</w:t>
+            </w:r>
+          </w:p>
+        </w:tc>
+        <w:tc>
+          <w:tcPr>
+            <w:tcW w:type="dxa" w:w="3135"/>
+          </w:tcPr>
+          <w:p>
+            <w:r>
+              <w:rPr>
+                <w:sz w:val="17"/>
+              </w:rPr>
+              <w:t>**[内容]**</w:t>
+            </w:r>
+          </w:p>
+        </w:tc>
+      </w:tr>
+      <w:tr>
+        <w:tc>
+          <w:tcPr>
+            <w:tcW w:type="dxa" w:w="3135"/>
+          </w:tcPr>
+          <w:p>
+            <w:r>
+              <w:rPr>
+                <w:sz w:val="17"/>
+              </w:rPr>
+              <w:t>ハラスメント行為はないか</w:t>
+            </w:r>
+          </w:p>
+        </w:tc>
+        <w:tc>
+          <w:tcPr>
+            <w:tcW w:type="dxa" w:w="3135"/>
+          </w:tcPr>
+          <w:p>
+            <w:r>
+              <w:rPr>
+                <w:sz w:val="17"/>
+              </w:rPr>
+              <w:t>□なし　□あり</w:t>
+            </w:r>
+          </w:p>
+        </w:tc>
+        <w:tc>
+          <w:tcPr>
+            <w:tcW w:type="dxa" w:w="3135"/>
+          </w:tcPr>
+          <w:p>
+            <w:r>
+              <w:rPr>
+                <w:sz w:val="17"/>
+              </w:rPr>
+              <w:t>**[内容]**</w:t>
+            </w:r>
+          </w:p>
+        </w:tc>
+      </w:tr>
+      <w:tr>
+        <w:tc>
+          <w:tcPr>
+            <w:tcW w:type="dxa" w:w="3135"/>
+          </w:tcPr>
+          <w:p>
+            <w:r>
+              <w:rPr>
+                <w:sz w:val="17"/>
+              </w:rPr>
+              <w:t>いじめ・差別的な扱いはないか</w:t>
+            </w:r>
+          </w:p>
+        </w:tc>
+        <w:tc>
+          <w:tcPr>
+            <w:tcW w:type="dxa" w:w="3135"/>
+          </w:tcPr>
+          <w:p>
+            <w:r>
+              <w:rPr>
+                <w:sz w:val="17"/>
+              </w:rPr>
+              <w:t>□なし　□あり</w:t>
+            </w:r>
+          </w:p>
+        </w:tc>
+        <w:tc>
+          <w:tcPr>
+            <w:tcW w:type="dxa" w:w="3135"/>
+          </w:tcPr>
+          <w:p>
+            <w:r>
+              <w:rPr>
+                <w:sz w:val="17"/>
+              </w:rPr>
+              <w:t>**[内容]**</w:t>
+            </w:r>
+          </w:p>
+        </w:tc>
+      </w:tr>
+      <w:tr>
+        <w:tc>
+          <w:tcPr>
+            <w:tcW w:type="dxa" w:w="3135"/>
+          </w:tcPr>
+          <w:p>
+            <w:r>
+              <w:rPr>
+                <w:sz w:val="17"/>
+              </w:rPr>
+              <w:t>パスポート・在留カードは本人が管理しているか</w:t>
+            </w:r>
+          </w:p>
+        </w:tc>
+        <w:tc>
+          <w:tcPr>
+            <w:tcW w:type="dxa" w:w="3135"/>
+          </w:tcPr>
+          <w:p>
+            <w:r>
+              <w:rPr>
+                <w:sz w:val="17"/>
+              </w:rPr>
+              <w:t>□本人管理　□会社保管（本人同意：□あり □なし）　□強制取り上げ</w:t>
+            </w:r>
+          </w:p>
+        </w:tc>
+        <w:tc>
+          <w:tcPr>
+            <w:tcW w:type="dxa" w:w="3135"/>
+          </w:tcPr>
+          <w:p>
+            <w:r>
+              <w:rPr>
+                <w:sz w:val="17"/>
+              </w:rPr>
+              <w:t>**[詳細]**</w:t>
+            </w:r>
+          </w:p>
+        </w:tc>
+      </w:tr>
+      <w:tr>
+        <w:tc>
+          <w:tcPr>
+            <w:tcW w:type="dxa" w:w="3135"/>
+          </w:tcPr>
+          <w:p>
+            <w:r>
+              <w:rPr>
+                <w:sz w:val="17"/>
+              </w:rPr>
+              <w:t>強制的な貯蓄・不当な費用徴収はないか</w:t>
+            </w:r>
+          </w:p>
+        </w:tc>
+        <w:tc>
+          <w:tcPr>
+            <w:tcW w:type="dxa" w:w="3135"/>
+          </w:tcPr>
+          <w:p>
+            <w:r>
+              <w:rPr>
+                <w:sz w:val="17"/>
+              </w:rPr>
+              <w:t>□なし　□あり</w:t>
+            </w:r>
+          </w:p>
+        </w:tc>
+        <w:tc>
+          <w:tcPr>
+            <w:tcW w:type="dxa" w:w="3135"/>
+          </w:tcPr>
+          <w:p>
+            <w:r>
+              <w:rPr>
+                <w:sz w:val="17"/>
+              </w:rPr>
+              <w:t>**[詳細]**</w:t>
+            </w:r>
+          </w:p>
+        </w:tc>
+      </w:tr>
+      <w:tr>
+        <w:tc>
+          <w:tcPr>
+            <w:tcW w:type="dxa" w:w="3135"/>
+          </w:tcPr>
+          <w:p>
+            <w:r>
+              <w:rPr>
+                <w:sz w:val="17"/>
+              </w:rPr>
+              <w:t>外出・通信・プライベートへの不当な制限はないか</w:t>
+            </w:r>
+          </w:p>
+        </w:tc>
+        <w:tc>
+          <w:tcPr>
+            <w:tcW w:type="dxa" w:w="3135"/>
+          </w:tcPr>
+          <w:p>
+            <w:r>
+              <w:rPr>
+                <w:sz w:val="17"/>
+              </w:rPr>
+              <w:t>□なし　□あり</w:t>
+            </w:r>
+          </w:p>
+        </w:tc>
+        <w:tc>
+          <w:tcPr>
+            <w:tcW w:type="dxa" w:w="3135"/>
+          </w:tcPr>
+          <w:p>
+            <w:r>
+              <w:rPr>
+                <w:sz w:val="17"/>
+              </w:rPr>
+              <w:t>**[詳細]**</w:t>
+            </w:r>
+          </w:p>
+        </w:tc>
+      </w:tr>
+      <w:tr>
+        <w:tc>
+          <w:tcPr>
+            <w:tcW w:type="dxa" w:w="3135"/>
+          </w:tcPr>
+          <w:p>
+            <w:r>
+              <w:rPr>
+                <w:sz w:val="17"/>
+              </w:rPr>
+              <w:t>強制労働・脅迫・身体拘束等の人権侵害はないか</w:t>
+            </w:r>
+          </w:p>
+        </w:tc>
+        <w:tc>
+          <w:tcPr>
+            <w:tcW w:type="dxa" w:w="3135"/>
+          </w:tcPr>
+          <w:p>
+            <w:r>
+              <w:rPr>
+                <w:sz w:val="17"/>
+              </w:rPr>
+              <w:t>□なし　□あり</w:t>
+            </w:r>
+          </w:p>
+        </w:tc>
+        <w:tc>
+          <w:tcPr>
+            <w:tcW w:type="dxa" w:w="3135"/>
+          </w:tcPr>
+          <w:p>
+            <w:r>
+              <w:rPr>
+                <w:sz w:val="17"/>
+              </w:rPr>
+              <w:t>**[詳細]**</w:t>
+            </w:r>
+          </w:p>
+        </w:tc>
+      </w:tr>
+    </w:tbl>
+    <w:p/>
+    <w:p/>
+    <w:p>
+      <w:r>
+        <w:rPr>
+          <w:sz w:val="16"/>
+        </w:rPr>
+        <w:t>──────────────────────────────────────────────────</w:t>
+      </w:r>
+    </w:p>
+    <w:p/>
+    <w:p>
+      <w:r>
+        <w:rPr>
+          <w:b/>
+          <w:sz w:val="24"/>
+        </w:rPr>
+        <w:t>▌確認項目③：支援実施状況の把握</w:t>
+      </w:r>
+    </w:p>
+    <w:p/>
+    <w:tbl>
+      <w:tblPr>
+        <w:tblStyle w:val="TableGrid"/>
+        <w:tblW w:type="auto" w:w="0"/>
+        <w:tblLook w:firstColumn="1" w:firstRow="1" w:lastColumn="0" w:lastRow="0" w:noHBand="0" w:noVBand="1" w:val="04A0"/>
+      </w:tblPr>
+      <w:tblGrid>
+        <w:gridCol w:w="4703"/>
+        <w:gridCol w:w="4703"/>
+      </w:tblGrid>
+      <w:tr>
+        <w:tc>
+          <w:tcPr>
+            <w:tcW w:type="dxa" w:w="4703"/>
+          </w:tcPr>
+          <w:p>
+            <w:r>
+              <w:rPr>
+                <w:b/>
+                <w:sz w:val="17"/>
+              </w:rPr>
+              <w:t>確認項目</w:t>
+            </w:r>
+          </w:p>
+        </w:tc>
+        <w:tc>
+          <w:tcPr>
+            <w:tcW w:type="dxa" w:w="4703"/>
+          </w:tcPr>
+          <w:p>
+            <w:r>
+              <w:rPr>
+                <w:b/>
+                <w:sz w:val="17"/>
+              </w:rPr>
+              <w:t>結果</w:t>
+            </w:r>
+          </w:p>
+        </w:tc>
+      </w:tr>
+      <w:tr>
+        <w:tc>
+          <w:tcPr>
+            <w:tcW w:type="dxa" w:w="4703"/>
+          </w:tcPr>
+          <w:p>
+            <w:r>
+              <w:rPr>
+                <w:sz w:val="17"/>
+              </w:rPr>
+              <w:t>当機関（登録支援機関）の連絡先を外国人に案内しているか</w:t>
+            </w:r>
+          </w:p>
+        </w:tc>
+        <w:tc>
+          <w:tcPr>
+            <w:tcW w:type="dxa" w:w="4703"/>
+          </w:tcPr>
+          <w:p>
+            <w:r>
+              <w:rPr>
+                <w:sz w:val="17"/>
+              </w:rPr>
+              <w:t>□案内済　□未案内（→要対応）</w:t>
+            </w:r>
+          </w:p>
+        </w:tc>
+      </w:tr>
+      <w:tr>
+        <w:tc>
+          <w:tcPr>
+            <w:tcW w:type="dxa" w:w="4703"/>
+          </w:tcPr>
+          <w:p>
+            <w:r>
+              <w:rPr>
+                <w:sz w:val="17"/>
+              </w:rPr>
+              <w:t>外国人から監督者への苦情・相談はあるか</w:t>
+            </w:r>
+          </w:p>
+        </w:tc>
+        <w:tc>
+          <w:tcPr>
+            <w:tcW w:type="dxa" w:w="4703"/>
+          </w:tcPr>
+          <w:p>
+            <w:r>
+              <w:rPr>
+                <w:sz w:val="17"/>
+              </w:rPr>
+              <w:t>□なし　□あり（**[内容]**）</w:t>
+            </w:r>
+          </w:p>
+        </w:tc>
+      </w:tr>
+      <w:tr>
+        <w:tc>
+          <w:tcPr>
+            <w:tcW w:type="dxa" w:w="4703"/>
+          </w:tcPr>
+          <w:p>
+            <w:r>
+              <w:rPr>
+                <w:sz w:val="17"/>
+              </w:rPr>
+              <w:t>住民登録・社会保険等の公的手続きは完了しているか</w:t>
+            </w:r>
+          </w:p>
+        </w:tc>
+        <w:tc>
+          <w:tcPr>
+            <w:tcW w:type="dxa" w:w="4703"/>
+          </w:tcPr>
+          <w:p>
+            <w:r>
+              <w:rPr>
+                <w:sz w:val="17"/>
+              </w:rPr>
+              <w:t>□完了　□未完了（**[未完了内容]**）</w:t>
+            </w:r>
+          </w:p>
+        </w:tc>
+      </w:tr>
+      <w:tr>
+        <w:tc>
+          <w:tcPr>
+            <w:tcW w:type="dxa" w:w="4703"/>
+          </w:tcPr>
+          <w:p>
+            <w:r>
+              <w:rPr>
+                <w:sz w:val="17"/>
+              </w:rPr>
+              <w:t>外国人の日本語学習への取り組み状況</w:t>
+            </w:r>
+          </w:p>
+        </w:tc>
+        <w:tc>
+          <w:tcPr>
+            <w:tcW w:type="dxa" w:w="4703"/>
+          </w:tcPr>
+          <w:p>
+            <w:r>
+              <w:rPr>
+                <w:sz w:val="17"/>
+              </w:rPr>
+              <w:t>□積極的　□普通　□消極的</w:t>
+            </w:r>
+          </w:p>
+        </w:tc>
+      </w:tr>
+      <w:tr>
+        <w:tc>
+          <w:tcPr>
+            <w:tcW w:type="dxa" w:w="4703"/>
+          </w:tcPr>
+          <w:p>
+            <w:r>
+              <w:rPr>
+                <w:sz w:val="17"/>
+              </w:rPr>
+              <w:t>今後の雇用継続予定</w:t>
+            </w:r>
+          </w:p>
+        </w:tc>
+        <w:tc>
+          <w:tcPr>
+            <w:tcW w:type="dxa" w:w="4703"/>
+          </w:tcPr>
+          <w:p>
+            <w:r>
+              <w:rPr>
+                <w:sz w:val="17"/>
+              </w:rPr>
+              <w:t>□継続予定　□更新検討中　□終了予定（理由：**[理由]**、予定日：**[終了予定日]**）</w:t>
+            </w:r>
+          </w:p>
+        </w:tc>
+      </w:tr>
+    </w:tbl>
+    <w:p/>
+    <w:p/>
+    <w:p>
+      <w:r>
+        <w:rPr>
+          <w:sz w:val="16"/>
+        </w:rPr>
+        <w:t>──────────────────────────────────────────────────</w:t>
+      </w:r>
+    </w:p>
+    <w:p/>
+    <w:p>
+      <w:r>
+        <w:rPr>
+          <w:b/>
+          <w:sz w:val="24"/>
+        </w:rPr>
+        <w:t>▌受入機関からの特記事項・要望</w:t>
+      </w:r>
+    </w:p>
+    <w:p/>
+    <w:tbl>
+      <w:tblPr>
+        <w:tblStyle w:val="TableGrid"/>
+        <w:tblW w:type="auto" w:w="0"/>
+        <w:tblLook w:firstColumn="1" w:firstRow="1" w:lastColumn="0" w:lastRow="0" w:noHBand="0" w:noVBand="1" w:val="04A0"/>
+      </w:tblPr>
+      <w:tblGrid>
+        <w:gridCol w:w="4703"/>
+        <w:gridCol w:w="4703"/>
+      </w:tblGrid>
+      <w:tr>
+        <w:tc>
+          <w:tcPr>
+            <w:tcW w:type="dxa" w:w="4703"/>
+          </w:tcPr>
+          <w:p>
+            <w:r>
+              <w:rPr>
+                <w:b/>
+                <w:sz w:val="17"/>
+              </w:rPr>
+              <w:t>項目</w:t>
+            </w:r>
+          </w:p>
+        </w:tc>
+        <w:tc>
+          <w:tcPr>
+            <w:tcW w:type="dxa" w:w="4703"/>
+          </w:tcPr>
+          <w:p>
+            <w:r>
+              <w:rPr>
+                <w:b/>
+                <w:sz w:val="17"/>
+              </w:rPr>
+              <w:t>内容</w:t>
+            </w:r>
+          </w:p>
+        </w:tc>
+      </w:tr>
+      <w:tr>
+        <w:tc>
+          <w:tcPr>
+            <w:tcW w:type="dxa" w:w="4703"/>
+          </w:tcPr>
+          <w:p>
+            <w:r>
+              <w:rPr>
+                <w:sz w:val="17"/>
+              </w:rPr>
+              <w:t>特記事項・要望</w:t>
+            </w:r>
+          </w:p>
+        </w:tc>
+        <w:tc>
+          <w:tcPr>
+            <w:tcW w:type="dxa" w:w="4703"/>
+          </w:tcPr>
+          <w:p>
+            <w:r>
+              <w:rPr>
+                <w:sz w:val="17"/>
+              </w:rPr>
+              <w:t>**[受入機関特記事項・要望]**（なければ「特になし」）</w:t>
+            </w:r>
+          </w:p>
+        </w:tc>
+      </w:tr>
+    </w:tbl>
+    <w:p/>
+    <w:p/>
+    <w:p>
+      <w:r>
+        <w:rPr>
+          <w:sz w:val="16"/>
+        </w:rPr>
+        <w:t>──────────────────────────────────────────────────</w:t>
+      </w:r>
+    </w:p>
+    <w:p/>
+    <w:p>
+      <w:r>
+        <w:rPr>
+          <w:b/>
+          <w:sz w:val="24"/>
+        </w:rPr>
+        <w:t>▌面談担当者の所見・対応方針</w:t>
+      </w:r>
+    </w:p>
+    <w:p/>
+    <w:tbl>
+      <w:tblPr>
+        <w:tblStyle w:val="TableGrid"/>
+        <w:tblW w:type="auto" w:w="0"/>
+        <w:tblLook w:firstColumn="1" w:firstRow="1" w:lastColumn="0" w:lastRow="0" w:noHBand="0" w:noVBand="1" w:val="04A0"/>
+      </w:tblPr>
+      <w:tblGrid>
+        <w:gridCol w:w="4703"/>
+        <w:gridCol w:w="4703"/>
+      </w:tblGrid>
+      <w:tr>
+        <w:tc>
+          <w:tcPr>
+            <w:tcW w:type="dxa" w:w="4703"/>
+          </w:tcPr>
+          <w:p>
+            <w:r>
+              <w:rPr>
+                <w:b/>
+                <w:sz w:val="17"/>
+              </w:rPr>
+              <w:t>項目</w:t>
+            </w:r>
+          </w:p>
+        </w:tc>
+        <w:tc>
+          <w:tcPr>
+            <w:tcW w:type="dxa" w:w="4703"/>
+          </w:tcPr>
+          <w:p>
+            <w:r>
+              <w:rPr>
+                <w:b/>
+                <w:sz w:val="17"/>
+              </w:rPr>
+              <w:t>内容</w:t>
+            </w:r>
+          </w:p>
+        </w:tc>
+      </w:tr>
+      <w:tr>
+        <w:tc>
+          <w:tcPr>
+            <w:tcW w:type="dxa" w:w="4703"/>
+          </w:tcPr>
+          <w:p>
+            <w:r>
+              <w:rPr>
+                <w:sz w:val="17"/>
+              </w:rPr>
+              <w:t>総合所見</w:t>
+            </w:r>
+          </w:p>
+        </w:tc>
+        <w:tc>
+          <w:tcPr>
+            <w:tcW w:type="dxa" w:w="4703"/>
+          </w:tcPr>
+          <w:p>
+            <w:r>
+              <w:rPr>
+                <w:sz w:val="17"/>
+              </w:rPr>
+              <w:t>**[総合所見]**</w:t>
+            </w:r>
+          </w:p>
+        </w:tc>
+      </w:tr>
+      <w:tr>
+        <w:tc>
+          <w:tcPr>
+            <w:tcW w:type="dxa" w:w="4703"/>
+          </w:tcPr>
+          <w:p>
+            <w:r>
+              <w:rPr>
+                <w:sz w:val="17"/>
+              </w:rPr>
+              <w:t>問題事案</w:t>
+            </w:r>
+          </w:p>
+        </w:tc>
+        <w:tc>
+          <w:tcPr>
+            <w:tcW w:type="dxa" w:w="4703"/>
+          </w:tcPr>
+          <w:p>
+            <w:r>
+              <w:rPr>
+                <w:sz w:val="17"/>
+              </w:rPr>
+              <w:t>□なし　□あり（以下に記載）</w:t>
+            </w:r>
+          </w:p>
+        </w:tc>
+      </w:tr>
+      <w:tr>
+        <w:tc>
+          <w:tcPr>
+            <w:tcW w:type="dxa" w:w="4703"/>
+          </w:tcPr>
+          <w:p>
+            <w:r>
+              <w:rPr>
+                <w:sz w:val="17"/>
+              </w:rPr>
+              <w:t>受入機関への指導内容</w:t>
+            </w:r>
+          </w:p>
+        </w:tc>
+        <w:tc>
+          <w:tcPr>
+            <w:tcW w:type="dxa" w:w="4703"/>
+          </w:tcPr>
+          <w:p>
+            <w:r>
+              <w:rPr>
+                <w:sz w:val="17"/>
+              </w:rPr>
+              <w:t>**[指導内容]**（なければ「特になし」）</w:t>
+            </w:r>
+          </w:p>
+        </w:tc>
+      </w:tr>
+      <w:tr>
+        <w:tc>
+          <w:tcPr>
+            <w:tcW w:type="dxa" w:w="4703"/>
+          </w:tcPr>
+          <w:p>
+            <w:r>
+              <w:rPr>
+                <w:sz w:val="17"/>
+              </w:rPr>
+              <w:t>行政機関への通報の要否</w:t>
+            </w:r>
+          </w:p>
+        </w:tc>
+        <w:tc>
+          <w:tcPr>
+            <w:tcW w:type="dxa" w:w="4703"/>
+          </w:tcPr>
+          <w:p>
+            <w:r>
+              <w:rPr>
+                <w:sz w:val="17"/>
+              </w:rPr>
+              <w:t>□不要　□必要（機関名：**[通報先機関名]**）</w:t>
+            </w:r>
+          </w:p>
+        </w:tc>
+      </w:tr>
+    </w:tbl>
+    <w:p/>
+    <w:p/>
+    <w:p>
+      <w:r>
+        <w:rPr>
+          <w:sz w:val="19"/>
+        </w:rPr>
+        <w:t>**問題事案・指導事項（あれば記載）**</w:t>
+      </w:r>
+    </w:p>
+    <w:p/>
+    <w:tbl>
+      <w:tblPr>
+        <w:tblStyle w:val="TableGrid"/>
+        <w:tblW w:type="auto" w:w="0"/>
+        <w:tblLook w:firstColumn="1" w:firstRow="1" w:lastColumn="0" w:lastRow="0" w:noHBand="0" w:noVBand="1" w:val="04A0"/>
+      </w:tblPr>
+      <w:tblGrid>
+        <w:gridCol w:w="1881"/>
+        <w:gridCol w:w="1881"/>
+        <w:gridCol w:w="1881"/>
+        <w:gridCol w:w="1881"/>
+        <w:gridCol w:w="1881"/>
+      </w:tblGrid>
+      <w:tr>
+        <w:tc>
+          <w:tcPr>
+            <w:tcW w:type="dxa" w:w="1881"/>
+          </w:tcPr>
+          <w:p>
+            <w:r>
+              <w:rPr>
+                <w:b/>
+                <w:sz w:val="17"/>
+              </w:rPr>
+              <w:t>No</w:t>
+            </w:r>
+          </w:p>
+        </w:tc>
+        <w:tc>
+          <w:tcPr>
+            <w:tcW w:type="dxa" w:w="1881"/>
+          </w:tcPr>
+          <w:p>
+            <w:r>
+              <w:rPr>
+                <w:b/>
+                <w:sz w:val="17"/>
+              </w:rPr>
+              <w:t>事案内容</w:t>
+            </w:r>
+          </w:p>
+        </w:tc>
+        <w:tc>
+          <w:tcPr>
+            <w:tcW w:type="dxa" w:w="1881"/>
+          </w:tcPr>
+          <w:p>
+            <w:r>
+              <w:rPr>
+                <w:b/>
+                <w:sz w:val="17"/>
+              </w:rPr>
+              <w:t>緊急度</w:t>
+            </w:r>
+          </w:p>
+        </w:tc>
+        <w:tc>
+          <w:tcPr>
+            <w:tcW w:type="dxa" w:w="1881"/>
+          </w:tcPr>
+          <w:p>
+            <w:r>
+              <w:rPr>
+                <w:b/>
+                <w:sz w:val="17"/>
+              </w:rPr>
+              <w:t>対応・指導内容</w:t>
+            </w:r>
+          </w:p>
+        </w:tc>
+        <w:tc>
+          <w:tcPr>
+            <w:tcW w:type="dxa" w:w="1881"/>
+          </w:tcPr>
+          <w:p>
+            <w:r>
+              <w:rPr>
+                <w:b/>
+                <w:sz w:val="17"/>
+              </w:rPr>
+              <w:t>対応期限</w:t>
+            </w:r>
+          </w:p>
+        </w:tc>
+      </w:tr>
+      <w:tr>
+        <w:tc>
+          <w:tcPr>
+            <w:tcW w:type="dxa" w:w="1881"/>
+          </w:tcPr>
+          <w:p>
+            <w:r>
+              <w:rPr>
+                <w:sz w:val="17"/>
+              </w:rPr>
+              <w:t>1</w:t>
+            </w:r>
+          </w:p>
+        </w:tc>
+        <w:tc>
+          <w:tcPr>
+            <w:tcW w:type="dxa" w:w="1881"/>
+          </w:tcPr>
+          <w:p>
+            <w:r>
+              <w:rPr>
+                <w:sz w:val="17"/>
+              </w:rPr>
+              <w:t>**[事案内容_1]**</w:t>
+            </w:r>
+          </w:p>
+        </w:tc>
+        <w:tc>
+          <w:tcPr>
+            <w:tcW w:type="dxa" w:w="1881"/>
+          </w:tcPr>
+          <w:p>
+            <w:r>
+              <w:rPr>
+                <w:sz w:val="17"/>
+              </w:rPr>
+              <w:t>□高　□中　□低</w:t>
+            </w:r>
+          </w:p>
+        </w:tc>
+        <w:tc>
+          <w:tcPr>
+            <w:tcW w:type="dxa" w:w="1881"/>
+          </w:tcPr>
+          <w:p>
+            <w:r>
+              <w:rPr>
+                <w:sz w:val="17"/>
+              </w:rPr>
+              <w:t>**[対応指導内容_1]**</w:t>
+            </w:r>
+          </w:p>
+        </w:tc>
+        <w:tc>
+          <w:tcPr>
+            <w:tcW w:type="dxa" w:w="1881"/>
+          </w:tcPr>
+          <w:p>
+            <w:r>
+              <w:rPr>
+                <w:sz w:val="17"/>
+              </w:rPr>
+              <w:t>**[対応期限_1]**</w:t>
+            </w:r>
+          </w:p>
+        </w:tc>
+      </w:tr>
+      <w:tr>
+        <w:tc>
+          <w:tcPr>
+            <w:tcW w:type="dxa" w:w="1881"/>
+          </w:tcPr>
+          <w:p>
+            <w:r>
+              <w:rPr>
+                <w:sz w:val="17"/>
+              </w:rPr>
+              <w:t>2</w:t>
+            </w:r>
+          </w:p>
+        </w:tc>
+        <w:tc>
+          <w:tcPr>
+            <w:tcW w:type="dxa" w:w="1881"/>
+          </w:tcPr>
+          <w:p>
+            <w:r>
+              <w:rPr>
+                <w:sz w:val="17"/>
+              </w:rPr>
+              <w:t>**[事案内容_2]**</w:t>
+            </w:r>
+          </w:p>
+        </w:tc>
+        <w:tc>
+          <w:tcPr>
+            <w:tcW w:type="dxa" w:w="1881"/>
+          </w:tcPr>
+          <w:p>
+            <w:r>
+              <w:rPr>
+                <w:sz w:val="17"/>
+              </w:rPr>
+              <w:t>□高　□中　□低</w:t>
+            </w:r>
+          </w:p>
+        </w:tc>
+        <w:tc>
+          <w:tcPr>
+            <w:tcW w:type="dxa" w:w="1881"/>
+          </w:tcPr>
+          <w:p>
+            <w:r>
+              <w:rPr>
+                <w:sz w:val="17"/>
+              </w:rPr>
+              <w:t>**[対応指導内容_2]**</w:t>
+            </w:r>
+          </w:p>
+        </w:tc>
+        <w:tc>
+          <w:tcPr>
+            <w:tcW w:type="dxa" w:w="1881"/>
+          </w:tcPr>
+          <w:p>
+            <w:r>
+              <w:rPr>
+                <w:sz w:val="17"/>
+              </w:rPr>
+              <w:t>**[対応期限_2]**</w:t>
+            </w:r>
+          </w:p>
+        </w:tc>
+      </w:tr>
+    </w:tbl>
+    <w:p/>
+    <w:p/>
+    <w:p>
+      <w:r>
+        <w:rPr>
+          <w:sz w:val="16"/>
+        </w:rPr>
+        <w:t>──────────────────────────────────────────────────</w:t>
+      </w:r>
+    </w:p>
+    <w:p/>
+    <w:p>
+      <w:r>
+        <w:rPr>
+          <w:b/>
+          <w:sz w:val="24"/>
+        </w:rPr>
+        <w:t>▌署名</w:t>
+      </w:r>
+    </w:p>
+    <w:p/>
+    <w:p>
+      <w:r>
+        <w:rPr>
+          <w:sz w:val="19"/>
+        </w:rPr>
+        <w:t>本面談の内容を確認しました。</w:t>
+      </w:r>
+    </w:p>
+    <w:p/>
+    <w:tbl>
+      <w:tblPr>
+        <w:tblStyle w:val="TableGrid"/>
+        <w:tblW w:type="auto" w:w="0"/>
+        <w:tblLook w:firstColumn="1" w:firstRow="1" w:lastColumn="0" w:lastRow="0" w:noHBand="0" w:noVBand="1" w:val="04A0"/>
+      </w:tblPr>
+      <w:tblGrid>
+        <w:gridCol w:w="3135"/>
+        <w:gridCol w:w="3135"/>
+        <w:gridCol w:w="3135"/>
+      </w:tblGrid>
+      <w:tr>
+        <w:tc>
+          <w:tcPr>
+            <w:tcW w:type="dxa" w:w="3135"/>
+          </w:tcPr>
+          <w:p>
+            <w:r>
+              <w:rPr>
+                <w:b/>
+                <w:sz w:val="17"/>
+              </w:rPr>
+              <w:t>役割</w:t>
+            </w:r>
+          </w:p>
+        </w:tc>
+        <w:tc>
+          <w:tcPr>
+            <w:tcW w:type="dxa" w:w="3135"/>
+          </w:tcPr>
+          <w:p>
+            <w:r>
+              <w:rPr>
+                <w:b/>
+                <w:sz w:val="17"/>
+              </w:rPr>
+              <w:t>氏名（署名）</w:t>
+            </w:r>
+          </w:p>
+        </w:tc>
+        <w:tc>
+          <w:tcPr>
+            <w:tcW w:type="dxa" w:w="3135"/>
+          </w:tcPr>
+          <w:p>
+            <w:r>
+              <w:rPr>
+                <w:b/>
+                <w:sz w:val="17"/>
+              </w:rPr>
+              <w:t>日付</w:t>
+            </w:r>
+          </w:p>
+        </w:tc>
+      </w:tr>
+      <w:tr>
+        <w:tc>
+          <w:tcPr>
+            <w:tcW w:type="dxa" w:w="3135"/>
+          </w:tcPr>
+          <w:p>
+            <w:r>
+              <w:rPr>
+                <w:sz w:val="17"/>
+              </w:rPr>
+              <w:t>監督者署名</w:t>
+            </w:r>
+          </w:p>
+        </w:tc>
+        <w:tc>
+          <w:tcPr>
+            <w:tcW w:type="dxa" w:w="3135"/>
+          </w:tcPr>
+          <w:p>
+            <w:r>
+              <w:rPr>
+                <w:sz w:val="17"/>
+              </w:rPr>
+              <w:t>**[監督者氏名]**（**[監督者役職]**）　印</w:t>
+            </w:r>
+          </w:p>
+        </w:tc>
+        <w:tc>
+          <w:tcPr>
+            <w:tcW w:type="dxa" w:w="3135"/>
+          </w:tcPr>
+          <w:p>
+            <w:r>
+              <w:rPr>
+                <w:sz w:val="17"/>
+              </w:rPr>
+              <w:t>令和 **[署名年]** 年 **[署名月]** 月 **[署名日]** 日</w:t>
+            </w:r>
+          </w:p>
+        </w:tc>
+      </w:tr>
+      <w:tr>
+        <w:tc>
+          <w:tcPr>
+            <w:tcW w:type="dxa" w:w="3135"/>
+          </w:tcPr>
+          <w:p>
+            <w:r>
+              <w:rPr>
+                <w:sz w:val="17"/>
+              </w:rPr>
+              <w:t>面談担当者</w:t>
+            </w:r>
+          </w:p>
+        </w:tc>
+        <w:tc>
+          <w:tcPr>
+            <w:tcW w:type="dxa" w:w="3135"/>
+          </w:tcPr>
+          <w:p>
+            <w:r>
+              <w:rPr>
+                <w:sz w:val="17"/>
+              </w:rPr>
+              <w:t>[面談担当者氏名]　印</w:t>
+            </w:r>
+          </w:p>
+        </w:tc>
+        <w:tc>
+          <w:tcPr>
+            <w:tcW w:type="dxa" w:w="3135"/>
+          </w:tcPr>
+          <w:p>
+            <w:r>
+              <w:rPr>
+                <w:sz w:val="17"/>
+              </w:rPr>
+              <w:t>同上</w:t>
+            </w:r>
+          </w:p>
+        </w:tc>
+      </w:tr>
+      <w:tr>
+        <w:tc>
+          <w:tcPr>
+            <w:tcW w:type="dxa" w:w="3135"/>
+          </w:tcPr>
+          <w:p>
+            <w:r>
+              <w:rPr>
+                <w:sz w:val="17"/>
+              </w:rPr>
+              <w:t>確認者</w:t>
+            </w:r>
+          </w:p>
+        </w:tc>
+        <w:tc>
+          <w:tcPr>
+            <w:tcW w:type="dxa" w:w="3135"/>
+          </w:tcPr>
+          <w:p>
+            <w:r>
+              <w:rPr>
+                <w:sz w:val="17"/>
+              </w:rPr>
+              <w:t>[確認者氏名・役職]　印</w:t>
+            </w:r>
+          </w:p>
+        </w:tc>
+        <w:tc>
+          <w:tcPr>
+            <w:tcW w:type="dxa" w:w="3135"/>
+          </w:tcPr>
+          <w:p>
+            <w:r>
+              <w:rPr>
+                <w:sz w:val="17"/>
+              </w:rPr>
+              <w:t>同上</w:t>
+            </w:r>
+          </w:p>
+        </w:tc>
+      </w:tr>
+    </w:tbl>
+    <w:p/>
     <w:p/>
     <w:sectPr>
       <w:pgSz w:w="12240" w:h="15840"/>
@@ -2707,7 +3123,7 @@
     <w:rsid w:val="00FC693F"/>
     <w:rPr>
       <w:rFonts w:ascii="MS Gothic" w:hAnsi="MS Gothic"/>
-      <w:sz w:val="20"/>
+      <w:sz w:val="19"/>
     </w:rPr>
   </w:style>
   <w:style w:type="paragraph" w:styleId="Header">

</xml_diff>